<commit_message>
21st August 2026 modified with phrase changes
Modified "Accused" to person under investigation
</commit_message>
<xml_diff>
--- a/CBI_Supplementary_Letter.docx
+++ b/CBI_Supplementary_Letter.docx
@@ -1,23 +1,19 @@
 
 <file path=word/document.xml><?xml version="1.0" encoding="utf-8"?>
-<w:document xmlns:wpc="http://schemas.microsoft.com/office/word/2010/wordprocessingCanvas" xmlns:cx="http://schemas.microsoft.com/office/drawing/2014/chartex" xmlns:cx1="http://schemas.microsoft.com/office/drawing/2015/9/8/chartex" xmlns:cx2="http://schemas.microsoft.com/office/drawing/2015/10/21/chartex" xmlns:cx3="http://schemas.microsoft.com/office/drawing/2016/5/9/chartex" xmlns:cx4="http://schemas.microsoft.com/office/drawing/2016/5/10/chartex" xmlns:cx5="http://schemas.microsoft.com/office/drawing/2016/5/11/chartex" xmlns:cx6="http://schemas.microsoft.com/office/drawing/2016/5/12/chartex" xmlns:cx7="http://schemas.microsoft.com/office/drawing/2016/5/13/chartex" xmlns:cx8="http://schemas.microsoft.com/office/drawing/2016/5/14/chartex" xmlns:mc="http://schemas.openxmlformats.org/markup-compatibility/2006" xmlns:aink="http://schemas.microsoft.com/office/drawing/2016/ink" xmlns:am3d="http://schemas.microsoft.com/office/drawing/2017/model3d" xmlns:o="urn:schemas-microsoft-com:office:office" xmlns:oel="http://schemas.microsoft.com/office/2019/extlst" xmlns:r="http://schemas.openxmlformats.org/officeDocument/2006/relationships" xmlns:m="http://schemas.openxmlformats.org/officeDocument/2006/math" xmlns:v="urn:schemas-microsoft-com:vml" xmlns:wp14="http://schemas.microsoft.com/office/word/2010/wordprocessingDrawing" xmlns:wp="http://schemas.openxmlformats.org/drawingml/2006/wordprocessingDrawing" xmlns:w10="urn:schemas-microsoft-com:office:word" xmlns:w="http://schemas.openxmlformats.org/wordprocessingml/2006/main" xmlns:w14="http://schemas.microsoft.com/office/word/2010/wordml" xmlns:w15="http://schemas.microsoft.com/office/word/2012/wordml" xmlns:w16cex="http://schemas.microsoft.com/office/word/2018/wordml/cex" xmlns:w16cid="http://schemas.microsoft.com/office/word/2016/wordml/cid" xmlns:w16="http://schemas.microsoft.com/office/word/2018/wordml" xmlns:w16du="http://schemas.microsoft.com/office/word/2023/wordml/word16du" xmlns:w16sdtdh="http://schemas.microsoft.com/office/word/2020/wordml/sdtdatahash" xmlns:w16sdtfl="http://schemas.microsoft.com/office/word/2024/wordml/sdtformatlock" xmlns:w16se="http://schemas.microsoft.com/office/word/2015/wordml/symex" xmlns:wpg="http://schemas.microsoft.com/office/word/2010/wordprocessingGroup" xmlns:wpi="http://schemas.microsoft.com/office/word/2010/wordprocessingInk" xmlns:wne="http://schemas.microsoft.com/office/word/2006/wordml" xmlns:wps="http://schemas.microsoft.com/office/word/2010/wordprocessingShape" mc:Ignorable="w14 w15 w16se w16cid w16 w16cex w16sdtdh w16sdtfl w16du wp14">
+<w:document xmlns:wpc="http://schemas.microsoft.com/office/word/2010/wordprocessingCanvas" xmlns:cx="http://schemas.microsoft.com/office/drawing/2014/chartex" xmlns:cx1="http://schemas.microsoft.com/office/drawing/2015/9/8/chartex" xmlns:cx2="http://schemas.microsoft.com/office/drawing/2015/10/21/chartex" xmlns:cx3="http://schemas.microsoft.com/office/drawing/2016/5/9/chartex" xmlns:cx4="http://schemas.microsoft.com/office/drawing/2016/5/10/chartex" xmlns:cx5="http://schemas.microsoft.com/office/drawing/2016/5/11/chartex" xmlns:cx6="http://schemas.microsoft.com/office/drawing/2016/5/12/chartex" xmlns:cx7="http://schemas.microsoft.com/office/drawing/2016/5/13/chartex" xmlns:cx8="http://schemas.microsoft.com/office/drawing/2016/5/14/chartex" xmlns:mc="http://schemas.openxmlformats.org/markup-compatibility/2006" xmlns:aink="http://schemas.microsoft.com/office/drawing/2016/ink" xmlns:am3d="http://schemas.microsoft.com/office/drawing/2017/model3d" xmlns:o="urn:schemas-microsoft-com:office:office" xmlns:oel="http://schemas.microsoft.com/office/2019/extlst" xmlns:r="http://schemas.openxmlformats.org/officeDocument/2006/relationships" xmlns:m="http://schemas.openxmlformats.org/officeDocument/2006/math" xmlns:v="urn:schemas-microsoft-com:vml" xmlns:wp14="http://schemas.microsoft.com/office/word/2010/wordprocessingDrawing" xmlns:wp="http://schemas.openxmlformats.org/drawingml/2006/wordprocessingDrawing" xmlns:w10="urn:schemas-microsoft-com:office:word" xmlns:w="http://schemas.openxmlformats.org/wordprocessingml/2006/main" xmlns:w14="http://schemas.microsoft.com/office/word/2010/wordml" xmlns:w15="http://schemas.microsoft.com/office/word/2012/wordml" xmlns:w16cei="http://schemas.microsoft.com/office/word/2026/wordml/cei" xmlns:w16cex="http://schemas.microsoft.com/office/word/2018/wordml/cex" xmlns:w16cid="http://schemas.microsoft.com/office/word/2016/wordml/cid" xmlns:w16="http://schemas.microsoft.com/office/word/2018/wordml" xmlns:w16du="http://schemas.microsoft.com/office/word/2023/wordml/word16du" xmlns:w16sdtdh="http://schemas.microsoft.com/office/word/2020/wordml/sdtdatahash" xmlns:w16sdtfl="http://schemas.microsoft.com/office/word/2024/wordml/sdtformatlock" xmlns:w16se="http://schemas.microsoft.com/office/word/2015/wordml/symex" xmlns:wpg="http://schemas.microsoft.com/office/word/2010/wordprocessingGroup" xmlns:wpi="http://schemas.microsoft.com/office/word/2010/wordprocessingInk" xmlns:wne="http://schemas.microsoft.com/office/word/2006/wordml" xmlns:wps="http://schemas.microsoft.com/office/word/2010/wordprocessingShape" mc:Ignorable="w14 w15 w16se w16cid w16 w16cex w16sdtdh w16sdtfl w16du wp14">
   <w:body>
     <w:p>
       <w:pPr>
         <w:spacing w:after="140"/>
         <w:jc w:val="center"/>
-        <w:rPr>
-          <w:sz w:val="22"/>
-          <w:szCs w:val="22"/>
-        </w:rPr>
       </w:pPr>
       <w:r>
         <w:rPr>
           <w:b/>
           <w:bCs/>
           <w:color w:val="1F3864"/>
-          <w:sz w:val="28"/>
-          <w:szCs w:val="28"/>
+          <w:sz w:val="26"/>
+          <w:szCs w:val="26"/>
         </w:rPr>
         <w:t>SUPPLEMENTARY COMPLAINT / STATEMENT OF SUBSEQUENT DEVELOPMENTS</w:t>
       </w:r>
@@ -45,141 +41,90 @@
       <w:pPr>
         <w:spacing w:after="140"/>
         <w:jc w:val="both"/>
+      </w:pPr>
+      <w:r>
+        <w:rPr>
+          <w:sz w:val="22"/>
+          <w:szCs w:val="22"/>
+        </w:rPr>
+        <w:t>To,</w:t>
+      </w:r>
+    </w:p>
+    <w:p>
+      <w:pPr>
+        <w:spacing w:after="140"/>
+        <w:jc w:val="both"/>
+      </w:pPr>
+      <w:r>
+        <w:rPr>
+          <w:sz w:val="22"/>
+          <w:szCs w:val="22"/>
+        </w:rPr>
+        <w:t>The Investigating Officer / Superintendent of Police,</w:t>
+      </w:r>
+    </w:p>
+    <w:p>
+      <w:pPr>
+        <w:spacing w:after="140"/>
+        <w:jc w:val="both"/>
+      </w:pPr>
+      <w:r>
+        <w:rPr>
+          <w:sz w:val="22"/>
+          <w:szCs w:val="22"/>
+        </w:rPr>
+        <w:t>Central Bureau of Investigation, Mumbai</w:t>
+      </w:r>
+    </w:p>
+    <w:p>
+      <w:pPr>
+        <w:spacing w:after="140"/>
+        <w:jc w:val="both"/>
+      </w:pPr>
+      <w:r>
+        <w:rPr>
+          <w:sz w:val="22"/>
+          <w:szCs w:val="22"/>
+        </w:rPr>
+        <w:t>[Branch / Unit as assigned upon transfer — please insert on receipt of acknowledgment]</w:t>
+      </w:r>
+    </w:p>
+    <w:p>
+      <w:pPr>
+        <w:spacing w:after="100"/>
+      </w:pPr>
+    </w:p>
+    <w:p>
+      <w:pPr>
+        <w:spacing w:after="140"/>
+        <w:jc w:val="both"/>
+      </w:pPr>
+      <w:r>
+        <w:rPr>
+          <w:sz w:val="22"/>
+          <w:szCs w:val="22"/>
+        </w:rPr>
+        <w:t>From: Neeraj Singh Mohnia, A-503, Marathon Eminence, Dadasaheb Gaikwad Marg, Mulund West, Mumbai – 400080 | Mobile: 9323722122 | Email: adarshimpexent@gmail.com</w:t>
+      </w:r>
+    </w:p>
+    <w:p>
+      <w:pPr>
+        <w:spacing w:after="100"/>
+      </w:pPr>
+    </w:p>
+    <w:p>
+      <w:pPr>
+        <w:spacing w:after="140"/>
+        <w:jc w:val="both"/>
+      </w:pPr>
+      <w:r>
         <w:rPr>
           <w:b/>
           <w:bCs/>
-          <w:sz w:val="24"/>
-          <w:szCs w:val="24"/>
-        </w:rPr>
-      </w:pPr>
-      <w:r>
-        <w:rPr>
-          <w:b/>
-          <w:bCs/>
-          <w:sz w:val="28"/>
-          <w:szCs w:val="28"/>
-        </w:rPr>
-        <w:t>To,</w:t>
-      </w:r>
-    </w:p>
-    <w:p>
-      <w:pPr>
-        <w:spacing w:after="140"/>
-        <w:jc w:val="both"/>
-        <w:rPr>
-          <w:b/>
-          <w:bCs/>
-          <w:sz w:val="24"/>
-          <w:szCs w:val="24"/>
-        </w:rPr>
-      </w:pPr>
-      <w:r>
-        <w:rPr>
-          <w:b/>
-          <w:bCs/>
-          <w:sz w:val="28"/>
-          <w:szCs w:val="28"/>
-        </w:rPr>
-        <w:t>The Investigating Officer / Superintendent of Police,</w:t>
-      </w:r>
-    </w:p>
-    <w:p>
-      <w:pPr>
-        <w:spacing w:after="140"/>
-        <w:jc w:val="both"/>
-        <w:rPr>
-          <w:b/>
-          <w:bCs/>
-          <w:sz w:val="24"/>
-          <w:szCs w:val="24"/>
-        </w:rPr>
-      </w:pPr>
-      <w:r>
-        <w:rPr>
-          <w:b/>
-          <w:bCs/>
-          <w:sz w:val="28"/>
-          <w:szCs w:val="28"/>
-        </w:rPr>
-        <w:t>Central Bureau of Investigation, Mumbai</w:t>
-      </w:r>
-    </w:p>
-    <w:p>
-      <w:pPr>
-        <w:spacing w:after="140"/>
-        <w:jc w:val="both"/>
-      </w:pPr>
-      <w:r>
-        <w:rPr>
-          <w:sz w:val="22"/>
-          <w:szCs w:val="22"/>
-        </w:rPr>
-        <w:t>[Branch / Unit as assigned upon transfer — please insert on receipt of acknowledgment]</w:t>
-      </w:r>
-    </w:p>
-    <w:p>
-      <w:pPr>
-        <w:spacing w:after="100"/>
-      </w:pPr>
-    </w:p>
-    <w:p>
-      <w:pPr>
-        <w:spacing w:after="140"/>
-        <w:jc w:val="both"/>
-      </w:pPr>
-      <w:r>
-        <w:rPr>
-          <w:b/>
-          <w:bCs/>
-          <w:sz w:val="22"/>
-          <w:szCs w:val="22"/>
-        </w:rPr>
-        <w:t>From:</w:t>
-      </w:r>
-      <w:r>
-        <w:rPr>
-          <w:sz w:val="22"/>
-          <w:szCs w:val="22"/>
-        </w:rPr>
-        <w:t xml:space="preserve"> Neeraj Singh Mohnia, A-503, Marathon Eminence, Dadasaheb Gaikwad Marg, Mulund West, Mumbai – 400080 | Mobile: 9323722122 | Email: adarshimpexent@gmail.com</w:t>
-      </w:r>
-    </w:p>
-    <w:p>
-      <w:pPr>
-        <w:spacing w:after="100"/>
-      </w:pPr>
-    </w:p>
-    <w:p>
-      <w:pPr>
-        <w:spacing w:after="140"/>
-        <w:jc w:val="both"/>
-      </w:pPr>
-      <w:r>
-        <w:rPr>
-          <w:b/>
-          <w:bCs/>
-          <w:sz w:val="28"/>
-          <w:szCs w:val="28"/>
-        </w:rPr>
-        <w:t>Subject</w:t>
-      </w:r>
-      <w:r>
-        <w:rPr>
-          <w:b/>
-          <w:bCs/>
-          <w:sz w:val="24"/>
-          <w:szCs w:val="24"/>
-        </w:rPr>
-        <w:t>:</w:t>
-      </w:r>
-      <w:r>
-        <w:rPr>
-          <w:b/>
-          <w:bCs/>
-          <w:sz w:val="22"/>
-          <w:szCs w:val="22"/>
-        </w:rPr>
-        <w:t xml:space="preserve"> Supplementary submission of material developments since transfer of complaint from EOW Mumbai (Ref. 993/VPNI/AJUVI/Unit 7(Shares)/2026 dated 08.05.2026) — for consideration in the ongoing investigation</w:t>
+          <w:sz w:val="22"/>
+          <w:szCs w:val="22"/>
+        </w:rPr>
+        <w:t>Subject: Supplementary submission of material developments since transfer of complaint from EOW Mumbai (Ref. 993/VPNI/AJUVI/Unit 7(Shares)/2026 dated 08.05.2026) — for consideration in the ongoing investigation</w:t>
       </w:r>
     </w:p>
     <w:p>
@@ -350,23 +295,7 @@
                 <w:sz w:val="19"/>
                 <w:szCs w:val="19"/>
               </w:rPr>
-              <w:t xml:space="preserve">Original complaint filed with EOW Mumbai, CVO Bank of India, and RBI Department of Supervision, documenting Rs. 51+ crore fraud across void mortgages on Government revenue land (R.S. No. 124, Padra) and a struck-off shell company (Shri </w:t>
-            </w:r>
-            <w:proofErr w:type="spellStart"/>
-            <w:r>
-              <w:rPr>
-                <w:sz w:val="19"/>
-                <w:szCs w:val="19"/>
-              </w:rPr>
-              <w:t>Maintainance</w:t>
-            </w:r>
-            <w:proofErr w:type="spellEnd"/>
-            <w:r>
-              <w:rPr>
-                <w:sz w:val="19"/>
-                <w:szCs w:val="19"/>
-              </w:rPr>
-              <w:t xml:space="preserve"> Contract Pvt. Ltd.), based on 37 anomalies across 19 official Government records (Layperson's Forensic Observation Report, Exhibit J-3).</w:t>
+              <w:t>Original complaint filed with EOW Mumbai, CVO Bank of India, and RBI Department of Supervision, documenting Rs. 51+ crore fraud across void mortgages on Government revenue land (R.S. No. 124, Padra) and a struck-off shell company (Shri Maintainance Contract Pvt. Ltd.), based on 37 anomalies across 19 official Government records (Layperson's Forensic Observation Report, Exhibit J-3).</w:t>
             </w:r>
           </w:p>
         </w:tc>
@@ -522,47 +451,17 @@
                 <w:sz w:val="19"/>
                 <w:szCs w:val="19"/>
               </w:rPr>
-              <w:t xml:space="preserve">EOW Mumbai formally transferred the entire complaint (59 pages of documents) to CBI Mumbai for further investigation, vide Reference No. 993/VPNI/AJUVI/Unit 7(Shares)/2026, </w:t>
-            </w:r>
-            <w:r>
-              <w:rPr>
-                <w:sz w:val="19"/>
-                <w:szCs w:val="19"/>
-              </w:rPr>
-              <w:lastRenderedPageBreak/>
-              <w:t xml:space="preserve">naming Shri Babulal </w:t>
-            </w:r>
-            <w:proofErr w:type="spellStart"/>
-            <w:r>
-              <w:rPr>
-                <w:sz w:val="19"/>
-                <w:szCs w:val="19"/>
-              </w:rPr>
-              <w:t>Ganeshmal</w:t>
-            </w:r>
-            <w:proofErr w:type="spellEnd"/>
-            <w:r>
-              <w:rPr>
-                <w:sz w:val="19"/>
-                <w:szCs w:val="19"/>
-              </w:rPr>
-              <w:t xml:space="preserve"> Bohra, Shri Ravi Babulal Bohra, and unknown officers of Bank of India, </w:t>
-            </w:r>
-            <w:proofErr w:type="spellStart"/>
-            <w:r>
-              <w:rPr>
-                <w:sz w:val="19"/>
-                <w:szCs w:val="19"/>
-              </w:rPr>
-              <w:t>Nagpada</w:t>
-            </w:r>
-            <w:proofErr w:type="spellEnd"/>
-            <w:r>
-              <w:rPr>
-                <w:sz w:val="19"/>
-                <w:szCs w:val="19"/>
-              </w:rPr>
-              <w:t xml:space="preserve"> Branch, as accused.</w:t>
+              <w:t xml:space="preserve">EOW Mumbai formally transferred the entire complaint (59 pages of documents) to CBI Mumbai for further investigation, vide Reference No. 993/VPNI/AJUVI/Unit 7(Shares)/2026, naming Shri Babulal Ganeshmal Bohra, Shri Ravi Babulal Bohra, and unknown officers of Bank of India, Nagpada Branch, </w:t>
+            </w:r>
+            <w:r>
+              <w:t>as persons whose conduct is the subject of investigation</w:t>
+            </w:r>
+            <w:r>
+              <w:rPr>
+                <w:sz w:val="19"/>
+                <w:szCs w:val="19"/>
+              </w:rPr>
+              <w:t>.</w:t>
             </w:r>
           </w:p>
         </w:tc>
@@ -771,23 +670,7 @@
                 <w:sz w:val="19"/>
                 <w:szCs w:val="19"/>
               </w:rPr>
-              <w:t xml:space="preserve">Discovery of a parallel fraud pattern at Bank of Baroda: CERSAI Asset ID 200028262710, concerning M/s S.G. Preservatives, showed an identical void-mortgage methodology on Government revenue land (Survey 885/886, </w:t>
-            </w:r>
-            <w:proofErr w:type="spellStart"/>
-            <w:r>
-              <w:rPr>
-                <w:sz w:val="19"/>
-                <w:szCs w:val="19"/>
-              </w:rPr>
-              <w:t>Asoj</w:t>
-            </w:r>
-            <w:proofErr w:type="spellEnd"/>
-            <w:r>
-              <w:rPr>
-                <w:sz w:val="19"/>
-                <w:szCs w:val="19"/>
-              </w:rPr>
-              <w:t xml:space="preserve"> Village) with valuation inflated by approximately 700%, revising the Complainant's documented total fraud quantum upward to Rs. 76.87 crore across three public sector banks.</w:t>
+              <w:t>Discovery of a parallel fraud pattern at Bank of Baroda: CERSAI Asset ID 200028262710, concerning M/s S.G. Preservatives, showed an identical void-mortgage methodology on Government revenue land (Survey 885/886, Asoj Village) with valuation inflated by approximately 700%, revising the Complainant's documented total fraud quantum upward to Rs. 76.87 crore across three public sector banks.</w:t>
             </w:r>
           </w:p>
         </w:tc>
@@ -1047,39 +930,7 @@
                 <w:sz w:val="19"/>
                 <w:szCs w:val="19"/>
               </w:rPr>
-              <w:t xml:space="preserve">Rashmi </w:t>
-            </w:r>
-            <w:proofErr w:type="spellStart"/>
-            <w:r>
-              <w:rPr>
-                <w:sz w:val="19"/>
-                <w:szCs w:val="19"/>
-              </w:rPr>
-              <w:t>Metasteel</w:t>
-            </w:r>
-            <w:proofErr w:type="spellEnd"/>
-            <w:r>
-              <w:rPr>
-                <w:sz w:val="19"/>
-                <w:szCs w:val="19"/>
-              </w:rPr>
-              <w:t xml:space="preserve"> Private Limited's Form 23AC (statutory filing with the Registrar of Companies) independently confirmed that Shri Ravi Babulal Bohra was a director of this entity as well, that it held zero fixed assets and zero inventory, and that its entire funding was sourced from 100% related-party borrowings — the same pattern already documented for Shri </w:t>
-            </w:r>
-            <w:proofErr w:type="spellStart"/>
-            <w:r>
-              <w:rPr>
-                <w:sz w:val="19"/>
-                <w:szCs w:val="19"/>
-              </w:rPr>
-              <w:t>Maintainance</w:t>
-            </w:r>
-            <w:proofErr w:type="spellEnd"/>
-            <w:r>
-              <w:rPr>
-                <w:sz w:val="19"/>
-                <w:szCs w:val="19"/>
-              </w:rPr>
-              <w:t xml:space="preserve"> Contract Pvt. Ltd.</w:t>
+              <w:t>Rashmi Metasteel Private Limited's Form 23AC (statutory filing with the Registrar of Companies) independently confirmed that Shri Ravi Babulal Bohra was a director of this entity as well, that it held zero fixed assets and zero inventory, and that its entire funding was sourced from 100% related-party borrowings — the same pattern already documented for Shri Maintainance Contract Pvt. Ltd.</w:t>
             </w:r>
           </w:p>
         </w:tc>
@@ -1214,42 +1065,15 @@
           <w:sz w:val="22"/>
           <w:szCs w:val="22"/>
         </w:rPr>
+        <w:t xml:space="preserve">1. The CERSAI record for the original Indian Overseas Bank charge on R.S. No. 124, Padra, continues to show “NOT SATISFIED” as of 20.05.2026 — more than thirteen years after registration — despite the same property </w:t>
+      </w:r>
+      <w:r>
+        <w:rPr>
+          <w:sz w:val="22"/>
+          <w:szCs w:val="22"/>
+        </w:rPr>
         <w:lastRenderedPageBreak/>
-        <w:t xml:space="preserve">1. The CERSAI record for the original Indian Overseas Bank charge on R.S. No. 124, Padra, continues to show “NOT SATISFIED” as of 20.05.2026 — </w:t>
-      </w:r>
-      <w:r>
-        <w:rPr>
-          <w:b/>
-          <w:bCs/>
-          <w:sz w:val="22"/>
-          <w:szCs w:val="22"/>
-          <w:highlight w:val="yellow"/>
-        </w:rPr>
-        <w:t>more than</w:t>
-      </w:r>
-      <w:r>
-        <w:rPr>
-          <w:sz w:val="22"/>
-          <w:szCs w:val="22"/>
-        </w:rPr>
-        <w:t xml:space="preserve"> thirteen years after registration — </w:t>
-      </w:r>
-      <w:r>
-        <w:rPr>
-          <w:b/>
-          <w:bCs/>
-          <w:sz w:val="22"/>
-          <w:szCs w:val="22"/>
-          <w:highlight w:val="yellow"/>
-        </w:rPr>
-        <w:t>despite</w:t>
-      </w:r>
-      <w:r>
-        <w:rPr>
-          <w:sz w:val="22"/>
-          <w:szCs w:val="22"/>
-        </w:rPr>
-        <w:t xml:space="preserve"> the same property having subsequently been offered as security to two further public sector banks. This is independently verifiable on the CERSAI public portal and requires no further corroboration from the Complainant.</w:t>
+        <w:t>having subsequently been offered as security to two further public sector banks. This is independently verifiable on the CERSAI public portal and requires no further corroboration from the Complainant.</w:t>
       </w:r>
     </w:p>
     <w:p>
@@ -1262,262 +1086,23 @@
           <w:sz w:val="22"/>
           <w:szCs w:val="22"/>
         </w:rPr>
-        <w:t xml:space="preserve">2. The </w:t>
-      </w:r>
-      <w:r>
-        <w:rPr>
-          <w:b/>
-          <w:bCs/>
-          <w:sz w:val="22"/>
-          <w:szCs w:val="22"/>
-        </w:rPr>
-        <w:t>Form CHG-4</w:t>
-      </w:r>
-      <w:r>
-        <w:rPr>
-          <w:sz w:val="22"/>
-          <w:szCs w:val="22"/>
-        </w:rPr>
-        <w:t xml:space="preserve"> filed </w:t>
-      </w:r>
-      <w:r>
-        <w:rPr>
-          <w:b/>
-          <w:bCs/>
-          <w:sz w:val="22"/>
-          <w:szCs w:val="22"/>
-        </w:rPr>
-        <w:t>by</w:t>
-      </w:r>
-      <w:r>
-        <w:rPr>
-          <w:sz w:val="22"/>
-          <w:szCs w:val="22"/>
-        </w:rPr>
-        <w:t xml:space="preserve"> Light and Glaze Profile Pvt. Ltd. was signed, as Director, </w:t>
-      </w:r>
-      <w:r>
-        <w:rPr>
-          <w:b/>
-          <w:bCs/>
-          <w:color w:val="EE0000"/>
-          <w:sz w:val="22"/>
-          <w:szCs w:val="22"/>
-          <w:highlight w:val="yellow"/>
-        </w:rPr>
-        <w:t>by</w:t>
-      </w:r>
-      <w:r>
-        <w:rPr>
-          <w:color w:val="EE0000"/>
-          <w:sz w:val="22"/>
-          <w:szCs w:val="22"/>
-        </w:rPr>
-        <w:t xml:space="preserve"> </w:t>
-      </w:r>
-      <w:r>
-        <w:rPr>
-          <w:sz w:val="22"/>
-          <w:szCs w:val="22"/>
-        </w:rPr>
-        <w:t xml:space="preserve">Shri Srinivas Saikumar Anne, against a satisfaction date </w:t>
-      </w:r>
-      <w:r>
-        <w:rPr>
-          <w:b/>
-          <w:bCs/>
-          <w:sz w:val="22"/>
-          <w:szCs w:val="22"/>
-        </w:rPr>
-        <w:t>of 19.10.2015</w:t>
-      </w:r>
-      <w:r>
-        <w:rPr>
-          <w:sz w:val="22"/>
-          <w:szCs w:val="22"/>
-        </w:rPr>
-        <w:t xml:space="preserve">. The Registrar of Companies' record </w:t>
-      </w:r>
-      <w:r>
-        <w:rPr>
-          <w:b/>
-          <w:bCs/>
-          <w:sz w:val="22"/>
-          <w:szCs w:val="22"/>
-          <w:highlight w:val="yellow"/>
-        </w:rPr>
-        <w:t>for</w:t>
-      </w:r>
-      <w:r>
-        <w:rPr>
-          <w:sz w:val="22"/>
-          <w:szCs w:val="22"/>
-        </w:rPr>
-        <w:t xml:space="preserve"> Light and Glaze </w:t>
-      </w:r>
-      <w:r>
-        <w:rPr>
-          <w:b/>
-          <w:bCs/>
-          <w:color w:val="EE0000"/>
-          <w:sz w:val="22"/>
-          <w:szCs w:val="22"/>
-          <w:highlight w:val="yellow"/>
-        </w:rPr>
-        <w:t>does not</w:t>
-      </w:r>
-      <w:r>
-        <w:rPr>
-          <w:sz w:val="22"/>
-          <w:szCs w:val="22"/>
-        </w:rPr>
-        <w:t xml:space="preserve">, on its face, </w:t>
-      </w:r>
-      <w:r>
-        <w:rPr>
-          <w:b/>
-          <w:bCs/>
-          <w:sz w:val="22"/>
-          <w:szCs w:val="22"/>
-          <w:highlight w:val="yellow"/>
-        </w:rPr>
-        <w:t>evidence any</w:t>
-      </w:r>
-      <w:r>
-        <w:rPr>
-          <w:sz w:val="22"/>
-          <w:szCs w:val="22"/>
-        </w:rPr>
-        <w:t xml:space="preserve"> Form DIR-12 </w:t>
-      </w:r>
-      <w:r>
-        <w:rPr>
-          <w:b/>
-          <w:bCs/>
-          <w:sz w:val="22"/>
-          <w:szCs w:val="22"/>
-        </w:rPr>
-        <w:t>or</w:t>
-      </w:r>
-      <w:r>
-        <w:rPr>
-          <w:sz w:val="22"/>
-          <w:szCs w:val="22"/>
-        </w:rPr>
-        <w:t xml:space="preserve"> comparable record </w:t>
-      </w:r>
-      <w:r>
-        <w:rPr>
-          <w:b/>
-          <w:bCs/>
-          <w:sz w:val="22"/>
-          <w:szCs w:val="22"/>
-          <w:highlight w:val="yellow"/>
-        </w:rPr>
-        <w:t>of</w:t>
-      </w:r>
-      <w:r>
-        <w:rPr>
-          <w:sz w:val="22"/>
-          <w:szCs w:val="22"/>
-        </w:rPr>
-        <w:t xml:space="preserve"> Mr. Anne's cessation </w:t>
-      </w:r>
-      <w:r>
-        <w:rPr>
-          <w:b/>
-          <w:bCs/>
-          <w:sz w:val="22"/>
-          <w:szCs w:val="22"/>
-        </w:rPr>
-        <w:t>as</w:t>
-      </w:r>
-      <w:r>
-        <w:rPr>
-          <w:sz w:val="22"/>
-          <w:szCs w:val="22"/>
-        </w:rPr>
-        <w:t xml:space="preserve"> Director of that company </w:t>
-      </w:r>
-      <w:r>
-        <w:rPr>
-          <w:b/>
-          <w:bCs/>
-          <w:sz w:val="22"/>
-          <w:szCs w:val="22"/>
-        </w:rPr>
-        <w:t>at any</w:t>
-      </w:r>
-      <w:r>
-        <w:rPr>
-          <w:sz w:val="22"/>
-          <w:szCs w:val="22"/>
-        </w:rPr>
-        <w:t xml:space="preserve"> point. The Complainant </w:t>
-      </w:r>
-      <w:r>
-        <w:rPr>
-          <w:b/>
-          <w:bCs/>
-          <w:sz w:val="22"/>
-          <w:szCs w:val="22"/>
-        </w:rPr>
-        <w:t>does not</w:t>
-      </w:r>
-      <w:r>
-        <w:rPr>
-          <w:sz w:val="22"/>
-          <w:szCs w:val="22"/>
-        </w:rPr>
-        <w:t xml:space="preserve"> assert a confirmed resignation date </w:t>
-      </w:r>
-      <w:r>
-        <w:rPr>
-          <w:b/>
-          <w:bCs/>
-          <w:sz w:val="22"/>
-          <w:szCs w:val="22"/>
-        </w:rPr>
-        <w:t>on</w:t>
-      </w:r>
-      <w:r>
-        <w:rPr>
-          <w:sz w:val="22"/>
-          <w:szCs w:val="22"/>
-        </w:rPr>
-        <w:t xml:space="preserve"> this record alone, </w:t>
-      </w:r>
-      <w:r>
-        <w:rPr>
-          <w:b/>
-          <w:bCs/>
-          <w:sz w:val="22"/>
-          <w:szCs w:val="22"/>
-        </w:rPr>
-        <w:t>and</w:t>
-      </w:r>
-      <w:r>
-        <w:rPr>
-          <w:sz w:val="22"/>
-          <w:szCs w:val="22"/>
-        </w:rPr>
-        <w:t xml:space="preserve"> respectfully submits that </w:t>
-      </w:r>
-      <w:r>
-        <w:rPr>
-          <w:b/>
-          <w:bCs/>
-          <w:sz w:val="22"/>
-          <w:szCs w:val="22"/>
-        </w:rPr>
-        <w:t>the absence itself</w:t>
-      </w:r>
-      <w:r>
-        <w:rPr>
-          <w:sz w:val="22"/>
-          <w:szCs w:val="22"/>
-        </w:rPr>
-        <w:t xml:space="preserve"> — for a company subsequently struck off — is the anomaly warranting production of the company's complete director-history record, rather than a conclusion the Complainant is in a position to draw unaided.</w:t>
+        <w:t xml:space="preserve">2. The Form CHG-4 filed by Light and Glaze Profile Pvt. Ltd. was signed, as Director, by Shri Srinivas Saikumar Anne, against a satisfaction date of 19.10.2015. The Registrar of Companies' record for Light and Glaze does not, on its face, evidence any Form DIR-12 or comparable record of Mr. Anne's cessation as Director of that company at any point. The Complainant does not assert a confirmed resignation date on this record </w:t>
+      </w:r>
+      <w:proofErr w:type="gramStart"/>
+      <w:r>
+        <w:rPr>
+          <w:sz w:val="22"/>
+          <w:szCs w:val="22"/>
+        </w:rPr>
+        <w:t>alone, and</w:t>
+      </w:r>
+      <w:proofErr w:type="gramEnd"/>
+      <w:r>
+        <w:rPr>
+          <w:sz w:val="22"/>
+          <w:szCs w:val="22"/>
+        </w:rPr>
+        <w:t xml:space="preserve"> respectfully submits that the absence itself — for a company subsequently struck off — is the anomaly warranting production of the company's complete director-history record, rather than a conclusion the Complainant is in a position to draw unaided.</w:t>
       </w:r>
     </w:p>
     <w:p>
@@ -1543,55 +1128,23 @@
           <w:sz w:val="22"/>
           <w:szCs w:val="22"/>
         </w:rPr>
-        <w:t xml:space="preserve">4. The newly discovered Bank of Baroda exposure (CERSAI Asset ID 200028262710, M/s S.G. Preservatives) follows a </w:t>
-      </w:r>
-      <w:r>
-        <w:rPr>
-          <w:b/>
-          <w:bCs/>
-          <w:sz w:val="22"/>
-          <w:szCs w:val="22"/>
-        </w:rPr>
-        <w:t>methodology materially similar</w:t>
-      </w:r>
-      <w:r>
-        <w:rPr>
-          <w:sz w:val="22"/>
-          <w:szCs w:val="22"/>
-        </w:rPr>
-        <w:t xml:space="preserve"> to the Bank of India </w:t>
-      </w:r>
-      <w:r>
-        <w:rPr>
-          <w:b/>
-          <w:bCs/>
-          <w:sz w:val="22"/>
-          <w:szCs w:val="22"/>
-        </w:rPr>
-        <w:t>and</w:t>
-      </w:r>
-      <w:r>
-        <w:rPr>
-          <w:sz w:val="22"/>
-          <w:szCs w:val="22"/>
-        </w:rPr>
-        <w:t xml:space="preserve"> Indian Overseas Bank exposures already under investigation — the same category of Government revenue land and a comparable pattern of valuation inflation. This raises the fraud quantum from the originally reported Rs. 51+ crore to approximately Rs. 76.87 crore, </w:t>
-      </w:r>
-      <w:r>
-        <w:rPr>
-          <w:b/>
-          <w:bCs/>
-          <w:sz w:val="22"/>
-          <w:szCs w:val="22"/>
-        </w:rPr>
-        <w:t>and suggests</w:t>
-      </w:r>
-      <w:r>
-        <w:rPr>
-          <w:sz w:val="22"/>
-          <w:szCs w:val="22"/>
-        </w:rPr>
-        <w:t xml:space="preserve"> the pattern may not be confined to the two banks originally named; the Complainant respectfully submits this as a lead for verification rather than a concluded fact.</w:t>
+        <w:t xml:space="preserve">4. The newly discovered Bank of Baroda exposure (CERSAI Asset ID 200028262710, M/s S.G. Preservatives) follows a methodology materially similar to the Bank of India and Indian Overseas Bank exposures already under investigation — the same category of Government revenue land and a comparable pattern of valuation inflation. This raises the fraud quantum from the originally reported Rs. 51+ crore to approximately Rs. 76.87 </w:t>
+      </w:r>
+      <w:proofErr w:type="gramStart"/>
+      <w:r>
+        <w:rPr>
+          <w:sz w:val="22"/>
+          <w:szCs w:val="22"/>
+        </w:rPr>
+        <w:t>crore, and</w:t>
+      </w:r>
+      <w:proofErr w:type="gramEnd"/>
+      <w:r>
+        <w:rPr>
+          <w:sz w:val="22"/>
+          <w:szCs w:val="22"/>
+        </w:rPr>
+        <w:t xml:space="preserve"> suggests the pattern may not be confined to the two banks originally named; the Complainant respectfully submits this as a lead for verification rather than a concluded fact.</w:t>
       </w:r>
     </w:p>
     <w:p>
@@ -1604,39 +1157,7 @@
           <w:sz w:val="22"/>
           <w:szCs w:val="22"/>
         </w:rPr>
-        <w:t xml:space="preserve">5. The </w:t>
-      </w:r>
-      <w:proofErr w:type="spellStart"/>
-      <w:r>
-        <w:rPr>
-          <w:sz w:val="22"/>
-          <w:szCs w:val="22"/>
-        </w:rPr>
-        <w:t>RoC</w:t>
-      </w:r>
-      <w:proofErr w:type="spellEnd"/>
-      <w:r>
-        <w:rPr>
-          <w:sz w:val="22"/>
-          <w:szCs w:val="22"/>
-        </w:rPr>
-        <w:t xml:space="preserve">-certified Form 23AC of Rashmi </w:t>
-      </w:r>
-      <w:proofErr w:type="spellStart"/>
-      <w:r>
-        <w:rPr>
-          <w:sz w:val="22"/>
-          <w:szCs w:val="22"/>
-        </w:rPr>
-        <w:t>Metasteel</w:t>
-      </w:r>
-      <w:proofErr w:type="spellEnd"/>
-      <w:r>
-        <w:rPr>
-          <w:sz w:val="22"/>
-          <w:szCs w:val="22"/>
-        </w:rPr>
-        <w:t xml:space="preserve"> Pvt. Ltd. for FY 2012-13, signed by Ravi Babulal Bohra as Director on 05.09.2013, independently confirms: (a) zero tangible fixed assets of any kind; (b) zero operating income; (c) technical insolvency — accumulated losses of Rs. 22,75,814 against paid-up capital of Rs. 10,00,000; and (d) 100% of long-term borrowings — Rs. 23,861,026 — sourced exclusively from related parties, with zero from any bank or independent lender. This document was publicly available on the MCA portal at the time Bank of India sanctioned Rs. 6 </w:t>
+        <w:t xml:space="preserve">5. The RoC-certified Form 23AC of Rashmi Metasteel Pvt. Ltd. for FY 2012-13, signed by Ravi Babulal Bohra as Director on 05.09.2013, independently confirms: (a) zero tangible fixed assets of any kind; (b) zero operating income; (c) technical insolvency — accumulated losses of Rs. 22,75,814 against paid-up capital of Rs. 10,00,000; and (d) 100% of long-term borrowings — Rs. 23,861,026 — sourced exclusively from related parties, with zero from any bank or independent lender. This document was publicly available on the MCA portal at the time Bank of India sanctioned Rs. 6 </w:t>
       </w:r>
       <w:proofErr w:type="gramStart"/>
       <w:r>
@@ -1678,13 +1199,8 @@
           <w:sz w:val="22"/>
           <w:szCs w:val="22"/>
         </w:rPr>
-        <w:t>The Complainant remains available to furnish any of the above documents in their entirety, to appear before the Investigating Officer at short notice, and to provide any further clarification the investigation may require. This submission is made purely in aid of the investigation already underway, and the Complainant does not seek to direct its course.</w:t>
-      </w:r>
-    </w:p>
-    <w:p>
-      <w:pPr>
-        <w:spacing w:after="200"/>
-      </w:pPr>
+        <w:t>The Complainant wishes to place one structural observation before the Investigating Officer. Bank of India's institutional interest is in recovering its outstanding dues. Bank of India's advocate's mandate before the Debts Recovery Tribunal is to recover — not to expose the bank's own due diligence failures. There is therefore a structural reason why the evidence compiled by the Complainant — the Government of Gujarat's revenue records, the CERSAI double registration, the MCA strike-off confirmations, the CHG-4 anomalies, and Babulal Bohra's own handwritten self-declaration of Rs. 26.18 crore exposure in BOI's loan agreement — has not been placed on record by Bank of India's advocate in 78 months of DRT proceedings. The Complainant is the only party with both the evidence and the incentive to place the full picture on record. This submission to CBI is made in that same spirit.</w:t>
+      </w:r>
     </w:p>
     <w:p>
       <w:pPr>
@@ -1696,13 +1212,16 @@
           <w:sz w:val="22"/>
           <w:szCs w:val="22"/>
         </w:rPr>
-        <w:t>Yours faithfully,</w:t>
-      </w:r>
-    </w:p>
-    <w:p>
-      <w:pPr>
-        <w:spacing w:after="300"/>
-      </w:pPr>
+        <w:t xml:space="preserve">Six illustrative diagrams summarising the fraud network, its methodology, the timeline of events, and the regulatory violations are enclosed with this letter as visual aids for the Investigating Officer's reference. These diagrams are derived entirely from official government records and certified court documents — they do not constitute primary evidence but are intended to assist the investigation in comprehending the scheme quickly: (1) Act 1 — Shell Network Setup; (2) Act 2 — Void Mortgage and False Satisfaction; (3) Act 3 — Coordinated </w:t>
+      </w:r>
+      <w:r>
+        <w:rPr>
+          <w:sz w:val="22"/>
+          <w:szCs w:val="22"/>
+        </w:rPr>
+        <w:lastRenderedPageBreak/>
+        <w:t>Credit Extraction; (4) Act 4 — Coordinated Default and Disappearance; (5) Act 5 — Institutional Silence; (6) Act 6 — The Reckoning, 25.08.2026.</w:t>
+      </w:r>
     </w:p>
     <w:p>
       <w:pPr>
@@ -1714,8 +1233,13 @@
           <w:sz w:val="22"/>
           <w:szCs w:val="22"/>
         </w:rPr>
-        <w:t>Neeraj Singh Mohnia</w:t>
-      </w:r>
+        <w:t>The Complainant remains available to furnish any of the above documents in their entirety, to appear before the Investigating Officer at short notice, and to provide any further clarification the investigation may require. This submission is made purely in aid of the investigation already underway, and the Complainant does not seek to direct its course.</w:t>
+      </w:r>
+    </w:p>
+    <w:p>
+      <w:pPr>
+        <w:spacing w:after="200"/>
+      </w:pPr>
     </w:p>
     <w:p>
       <w:pPr>
@@ -1727,8 +1251,13 @@
           <w:sz w:val="22"/>
           <w:szCs w:val="22"/>
         </w:rPr>
-        <w:t>Place: Mumbai</w:t>
-      </w:r>
+        <w:t>Yours faithfully,</w:t>
+      </w:r>
+    </w:p>
+    <w:p>
+      <w:pPr>
+        <w:spacing w:after="300"/>
+      </w:pPr>
     </w:p>
     <w:p>
       <w:pPr>
@@ -1740,15 +1269,33 @@
           <w:sz w:val="22"/>
           <w:szCs w:val="22"/>
         </w:rPr>
-        <w:lastRenderedPageBreak/>
-        <w:t xml:space="preserve">Date: </w:t>
-      </w:r>
-      <w:r>
-        <w:rPr>
-          <w:sz w:val="22"/>
-          <w:szCs w:val="22"/>
-        </w:rPr>
-        <w:t xml:space="preserve">   August 2026</w:t>
+        <w:t>Neeraj Singh Mohnia</w:t>
+      </w:r>
+    </w:p>
+    <w:p>
+      <w:pPr>
+        <w:spacing w:after="140"/>
+        <w:jc w:val="both"/>
+      </w:pPr>
+      <w:r>
+        <w:rPr>
+          <w:sz w:val="22"/>
+          <w:szCs w:val="22"/>
+        </w:rPr>
+        <w:t>Place: Mumbai</w:t>
+      </w:r>
+    </w:p>
+    <w:p>
+      <w:pPr>
+        <w:spacing w:after="140"/>
+        <w:jc w:val="both"/>
+      </w:pPr>
+      <w:r>
+        <w:rPr>
+          <w:sz w:val="22"/>
+          <w:szCs w:val="22"/>
+        </w:rPr>
+        <w:t>Date: 25.08.2026</w:t>
       </w:r>
     </w:p>
     <w:sectPr>
@@ -1764,7 +1311,7 @@
 </file>
 
 <file path=word/endnotes.xml><?xml version="1.0" encoding="utf-8"?>
-<w:endnotes xmlns:wpc="http://schemas.microsoft.com/office/word/2010/wordprocessingCanvas" xmlns:cx="http://schemas.microsoft.com/office/drawing/2014/chartex" xmlns:cx1="http://schemas.microsoft.com/office/drawing/2015/9/8/chartex" xmlns:cx2="http://schemas.microsoft.com/office/drawing/2015/10/21/chartex" xmlns:cx3="http://schemas.microsoft.com/office/drawing/2016/5/9/chartex" xmlns:cx4="http://schemas.microsoft.com/office/drawing/2016/5/10/chartex" xmlns:cx5="http://schemas.microsoft.com/office/drawing/2016/5/11/chartex" xmlns:cx6="http://schemas.microsoft.com/office/drawing/2016/5/12/chartex" xmlns:cx7="http://schemas.microsoft.com/office/drawing/2016/5/13/chartex" xmlns:cx8="http://schemas.microsoft.com/office/drawing/2016/5/14/chartex" xmlns:mc="http://schemas.openxmlformats.org/markup-compatibility/2006" xmlns:aink="http://schemas.microsoft.com/office/drawing/2016/ink" xmlns:am3d="http://schemas.microsoft.com/office/drawing/2017/model3d" xmlns:o="urn:schemas-microsoft-com:office:office" xmlns:oel="http://schemas.microsoft.com/office/2019/extlst" xmlns:r="http://schemas.openxmlformats.org/officeDocument/2006/relationships" xmlns:m="http://schemas.openxmlformats.org/officeDocument/2006/math" xmlns:v="urn:schemas-microsoft-com:vml" xmlns:wp14="http://schemas.microsoft.com/office/word/2010/wordprocessingDrawing" xmlns:wp="http://schemas.openxmlformats.org/drawingml/2006/wordprocessingDrawing" xmlns:w10="urn:schemas-microsoft-com:office:word" xmlns:w="http://schemas.openxmlformats.org/wordprocessingml/2006/main" xmlns:w14="http://schemas.microsoft.com/office/word/2010/wordml" xmlns:w15="http://schemas.microsoft.com/office/word/2012/wordml" xmlns:w16cex="http://schemas.microsoft.com/office/word/2018/wordml/cex" xmlns:w16cid="http://schemas.microsoft.com/office/word/2016/wordml/cid" xmlns:w16="http://schemas.microsoft.com/office/word/2018/wordml" xmlns:w16du="http://schemas.microsoft.com/office/word/2023/wordml/word16du" xmlns:w16sdtdh="http://schemas.microsoft.com/office/word/2020/wordml/sdtdatahash" xmlns:w16sdtfl="http://schemas.microsoft.com/office/word/2024/wordml/sdtformatlock" xmlns:w16se="http://schemas.microsoft.com/office/word/2015/wordml/symex" xmlns:wpg="http://schemas.microsoft.com/office/word/2010/wordprocessingGroup" xmlns:wpi="http://schemas.microsoft.com/office/word/2010/wordprocessingInk" xmlns:wne="http://schemas.microsoft.com/office/word/2006/wordml" xmlns:wps="http://schemas.microsoft.com/office/word/2010/wordprocessingShape" mc:Ignorable="w14 w15 w16se w16cid w16 w16cex w16sdtdh w16sdtfl w16du wp14">
+<w:endnotes xmlns:wpc="http://schemas.microsoft.com/office/word/2010/wordprocessingCanvas" xmlns:cx="http://schemas.microsoft.com/office/drawing/2014/chartex" xmlns:cx1="http://schemas.microsoft.com/office/drawing/2015/9/8/chartex" xmlns:cx2="http://schemas.microsoft.com/office/drawing/2015/10/21/chartex" xmlns:cx3="http://schemas.microsoft.com/office/drawing/2016/5/9/chartex" xmlns:cx4="http://schemas.microsoft.com/office/drawing/2016/5/10/chartex" xmlns:cx5="http://schemas.microsoft.com/office/drawing/2016/5/11/chartex" xmlns:cx6="http://schemas.microsoft.com/office/drawing/2016/5/12/chartex" xmlns:cx7="http://schemas.microsoft.com/office/drawing/2016/5/13/chartex" xmlns:cx8="http://schemas.microsoft.com/office/drawing/2016/5/14/chartex" xmlns:mc="http://schemas.openxmlformats.org/markup-compatibility/2006" xmlns:aink="http://schemas.microsoft.com/office/drawing/2016/ink" xmlns:am3d="http://schemas.microsoft.com/office/drawing/2017/model3d" xmlns:o="urn:schemas-microsoft-com:office:office" xmlns:oel="http://schemas.microsoft.com/office/2019/extlst" xmlns:r="http://schemas.openxmlformats.org/officeDocument/2006/relationships" xmlns:m="http://schemas.openxmlformats.org/officeDocument/2006/math" xmlns:v="urn:schemas-microsoft-com:vml" xmlns:wp14="http://schemas.microsoft.com/office/word/2010/wordprocessingDrawing" xmlns:wp="http://schemas.openxmlformats.org/drawingml/2006/wordprocessingDrawing" xmlns:w10="urn:schemas-microsoft-com:office:word" xmlns:w="http://schemas.openxmlformats.org/wordprocessingml/2006/main" xmlns:w14="http://schemas.microsoft.com/office/word/2010/wordml" xmlns:w15="http://schemas.microsoft.com/office/word/2012/wordml" xmlns:w16cei="http://schemas.microsoft.com/office/word/2026/wordml/cei" xmlns:w16cex="http://schemas.microsoft.com/office/word/2018/wordml/cex" xmlns:w16cid="http://schemas.microsoft.com/office/word/2016/wordml/cid" xmlns:w16="http://schemas.microsoft.com/office/word/2018/wordml" xmlns:w16du="http://schemas.microsoft.com/office/word/2023/wordml/word16du" xmlns:w16sdtdh="http://schemas.microsoft.com/office/word/2020/wordml/sdtdatahash" xmlns:w16sdtfl="http://schemas.microsoft.com/office/word/2024/wordml/sdtformatlock" xmlns:w16se="http://schemas.microsoft.com/office/word/2015/wordml/symex" xmlns:wpg="http://schemas.microsoft.com/office/word/2010/wordprocessingGroup" xmlns:wpi="http://schemas.microsoft.com/office/word/2010/wordprocessingInk" xmlns:wne="http://schemas.microsoft.com/office/word/2006/wordml" xmlns:wps="http://schemas.microsoft.com/office/word/2010/wordprocessingShape" mc:Ignorable="w14 w15 w16se w16cid w16 w16cex w16sdtdh w16sdtfl w16du wp14">
   <w:endnote w:type="separator" w:id="-1">
     <w:p>
       <w:r>
@@ -1783,7 +1330,7 @@
 </file>
 
 <file path=word/footer1.xml><?xml version="1.0" encoding="utf-8"?>
-<w:ftr xmlns:wpc="http://schemas.microsoft.com/office/word/2010/wordprocessingCanvas" xmlns:cx="http://schemas.microsoft.com/office/drawing/2014/chartex" xmlns:cx1="http://schemas.microsoft.com/office/drawing/2015/9/8/chartex" xmlns:cx2="http://schemas.microsoft.com/office/drawing/2015/10/21/chartex" xmlns:cx3="http://schemas.microsoft.com/office/drawing/2016/5/9/chartex" xmlns:cx4="http://schemas.microsoft.com/office/drawing/2016/5/10/chartex" xmlns:cx5="http://schemas.microsoft.com/office/drawing/2016/5/11/chartex" xmlns:cx6="http://schemas.microsoft.com/office/drawing/2016/5/12/chartex" xmlns:cx7="http://schemas.microsoft.com/office/drawing/2016/5/13/chartex" xmlns:cx8="http://schemas.microsoft.com/office/drawing/2016/5/14/chartex" xmlns:mc="http://schemas.openxmlformats.org/markup-compatibility/2006" xmlns:aink="http://schemas.microsoft.com/office/drawing/2016/ink" xmlns:am3d="http://schemas.microsoft.com/office/drawing/2017/model3d" xmlns:o="urn:schemas-microsoft-com:office:office" xmlns:oel="http://schemas.microsoft.com/office/2019/extlst" xmlns:r="http://schemas.openxmlformats.org/officeDocument/2006/relationships" xmlns:m="http://schemas.openxmlformats.org/officeDocument/2006/math" xmlns:v="urn:schemas-microsoft-com:vml" xmlns:wp14="http://schemas.microsoft.com/office/word/2010/wordprocessingDrawing" xmlns:wp="http://schemas.openxmlformats.org/drawingml/2006/wordprocessingDrawing" xmlns:w10="urn:schemas-microsoft-com:office:word" xmlns:w="http://schemas.openxmlformats.org/wordprocessingml/2006/main" xmlns:w14="http://schemas.microsoft.com/office/word/2010/wordml" xmlns:w15="http://schemas.microsoft.com/office/word/2012/wordml" xmlns:w16cex="http://schemas.microsoft.com/office/word/2018/wordml/cex" xmlns:w16cid="http://schemas.microsoft.com/office/word/2016/wordml/cid" xmlns:w16="http://schemas.microsoft.com/office/word/2018/wordml" xmlns:w16du="http://schemas.microsoft.com/office/word/2023/wordml/word16du" xmlns:w16sdtdh="http://schemas.microsoft.com/office/word/2020/wordml/sdtdatahash" xmlns:w16sdtfl="http://schemas.microsoft.com/office/word/2024/wordml/sdtformatlock" xmlns:w16se="http://schemas.microsoft.com/office/word/2015/wordml/symex" xmlns:wpg="http://schemas.microsoft.com/office/word/2010/wordprocessingGroup" xmlns:wpi="http://schemas.microsoft.com/office/word/2010/wordprocessingInk" xmlns:wne="http://schemas.microsoft.com/office/word/2006/wordml" xmlns:wps="http://schemas.microsoft.com/office/word/2010/wordprocessingShape" mc:Ignorable="w14 w15 w16se w16cid w16 w16cex w16sdtdh w16sdtfl w16du wp14">
+<w:ftr xmlns:wpc="http://schemas.microsoft.com/office/word/2010/wordprocessingCanvas" xmlns:cx="http://schemas.microsoft.com/office/drawing/2014/chartex" xmlns:cx1="http://schemas.microsoft.com/office/drawing/2015/9/8/chartex" xmlns:cx2="http://schemas.microsoft.com/office/drawing/2015/10/21/chartex" xmlns:cx3="http://schemas.microsoft.com/office/drawing/2016/5/9/chartex" xmlns:cx4="http://schemas.microsoft.com/office/drawing/2016/5/10/chartex" xmlns:cx5="http://schemas.microsoft.com/office/drawing/2016/5/11/chartex" xmlns:cx6="http://schemas.microsoft.com/office/drawing/2016/5/12/chartex" xmlns:cx7="http://schemas.microsoft.com/office/drawing/2016/5/13/chartex" xmlns:cx8="http://schemas.microsoft.com/office/drawing/2016/5/14/chartex" xmlns:mc="http://schemas.openxmlformats.org/markup-compatibility/2006" xmlns:aink="http://schemas.microsoft.com/office/drawing/2016/ink" xmlns:am3d="http://schemas.microsoft.com/office/drawing/2017/model3d" xmlns:o="urn:schemas-microsoft-com:office:office" xmlns:oel="http://schemas.microsoft.com/office/2019/extlst" xmlns:r="http://schemas.openxmlformats.org/officeDocument/2006/relationships" xmlns:m="http://schemas.openxmlformats.org/officeDocument/2006/math" xmlns:v="urn:schemas-microsoft-com:vml" xmlns:wp14="http://schemas.microsoft.com/office/word/2010/wordprocessingDrawing" xmlns:wp="http://schemas.openxmlformats.org/drawingml/2006/wordprocessingDrawing" xmlns:w10="urn:schemas-microsoft-com:office:word" xmlns:w="http://schemas.openxmlformats.org/wordprocessingml/2006/main" xmlns:w14="http://schemas.microsoft.com/office/word/2010/wordml" xmlns:w15="http://schemas.microsoft.com/office/word/2012/wordml" xmlns:w16cei="http://schemas.microsoft.com/office/word/2026/wordml/cei" xmlns:w16cex="http://schemas.microsoft.com/office/word/2018/wordml/cex" xmlns:w16cid="http://schemas.microsoft.com/office/word/2016/wordml/cid" xmlns:w16="http://schemas.microsoft.com/office/word/2018/wordml" xmlns:w16du="http://schemas.microsoft.com/office/word/2023/wordml/word16du" xmlns:w16sdtdh="http://schemas.microsoft.com/office/word/2020/wordml/sdtdatahash" xmlns:w16sdtfl="http://schemas.microsoft.com/office/word/2024/wordml/sdtformatlock" xmlns:w16se="http://schemas.microsoft.com/office/word/2015/wordml/symex" xmlns:wpg="http://schemas.microsoft.com/office/word/2010/wordprocessingGroup" xmlns:wpi="http://schemas.microsoft.com/office/word/2010/wordprocessingInk" xmlns:wne="http://schemas.microsoft.com/office/word/2006/wordml" xmlns:wps="http://schemas.microsoft.com/office/word/2010/wordprocessingShape" mc:Ignorable="w14 w15 w16se w16cid w16 w16cex w16sdtdh w16sdtfl w16du wp14">
   <w:p>
     <w:pPr>
       <w:jc w:val="right"/>
@@ -1891,7 +1438,7 @@
 </file>
 
 <file path=word/footnotes.xml><?xml version="1.0" encoding="utf-8"?>
-<w:footnotes xmlns:wpc="http://schemas.microsoft.com/office/word/2010/wordprocessingCanvas" xmlns:cx="http://schemas.microsoft.com/office/drawing/2014/chartex" xmlns:cx1="http://schemas.microsoft.com/office/drawing/2015/9/8/chartex" xmlns:cx2="http://schemas.microsoft.com/office/drawing/2015/10/21/chartex" xmlns:cx3="http://schemas.microsoft.com/office/drawing/2016/5/9/chartex" xmlns:cx4="http://schemas.microsoft.com/office/drawing/2016/5/10/chartex" xmlns:cx5="http://schemas.microsoft.com/office/drawing/2016/5/11/chartex" xmlns:cx6="http://schemas.microsoft.com/office/drawing/2016/5/12/chartex" xmlns:cx7="http://schemas.microsoft.com/office/drawing/2016/5/13/chartex" xmlns:cx8="http://schemas.microsoft.com/office/drawing/2016/5/14/chartex" xmlns:mc="http://schemas.openxmlformats.org/markup-compatibility/2006" xmlns:aink="http://schemas.microsoft.com/office/drawing/2016/ink" xmlns:am3d="http://schemas.microsoft.com/office/drawing/2017/model3d" xmlns:o="urn:schemas-microsoft-com:office:office" xmlns:oel="http://schemas.microsoft.com/office/2019/extlst" xmlns:r="http://schemas.openxmlformats.org/officeDocument/2006/relationships" xmlns:m="http://schemas.openxmlformats.org/officeDocument/2006/math" xmlns:v="urn:schemas-microsoft-com:vml" xmlns:wp14="http://schemas.microsoft.com/office/word/2010/wordprocessingDrawing" xmlns:wp="http://schemas.openxmlformats.org/drawingml/2006/wordprocessingDrawing" xmlns:w10="urn:schemas-microsoft-com:office:word" xmlns:w="http://schemas.openxmlformats.org/wordprocessingml/2006/main" xmlns:w14="http://schemas.microsoft.com/office/word/2010/wordml" xmlns:w15="http://schemas.microsoft.com/office/word/2012/wordml" xmlns:w16cex="http://schemas.microsoft.com/office/word/2018/wordml/cex" xmlns:w16cid="http://schemas.microsoft.com/office/word/2016/wordml/cid" xmlns:w16="http://schemas.microsoft.com/office/word/2018/wordml" xmlns:w16du="http://schemas.microsoft.com/office/word/2023/wordml/word16du" xmlns:w16sdtdh="http://schemas.microsoft.com/office/word/2020/wordml/sdtdatahash" xmlns:w16sdtfl="http://schemas.microsoft.com/office/word/2024/wordml/sdtformatlock" xmlns:w16se="http://schemas.microsoft.com/office/word/2015/wordml/symex" xmlns:wpg="http://schemas.microsoft.com/office/word/2010/wordprocessingGroup" xmlns:wpi="http://schemas.microsoft.com/office/word/2010/wordprocessingInk" xmlns:wne="http://schemas.microsoft.com/office/word/2006/wordml" xmlns:wps="http://schemas.microsoft.com/office/word/2010/wordprocessingShape" mc:Ignorable="w14 w15 w16se w16cid w16 w16cex w16sdtdh w16sdtfl w16du wp14">
+<w:footnotes xmlns:wpc="http://schemas.microsoft.com/office/word/2010/wordprocessingCanvas" xmlns:cx="http://schemas.microsoft.com/office/drawing/2014/chartex" xmlns:cx1="http://schemas.microsoft.com/office/drawing/2015/9/8/chartex" xmlns:cx2="http://schemas.microsoft.com/office/drawing/2015/10/21/chartex" xmlns:cx3="http://schemas.microsoft.com/office/drawing/2016/5/9/chartex" xmlns:cx4="http://schemas.microsoft.com/office/drawing/2016/5/10/chartex" xmlns:cx5="http://schemas.microsoft.com/office/drawing/2016/5/11/chartex" xmlns:cx6="http://schemas.microsoft.com/office/drawing/2016/5/12/chartex" xmlns:cx7="http://schemas.microsoft.com/office/drawing/2016/5/13/chartex" xmlns:cx8="http://schemas.microsoft.com/office/drawing/2016/5/14/chartex" xmlns:mc="http://schemas.openxmlformats.org/markup-compatibility/2006" xmlns:aink="http://schemas.microsoft.com/office/drawing/2016/ink" xmlns:am3d="http://schemas.microsoft.com/office/drawing/2017/model3d" xmlns:o="urn:schemas-microsoft-com:office:office" xmlns:oel="http://schemas.microsoft.com/office/2019/extlst" xmlns:r="http://schemas.openxmlformats.org/officeDocument/2006/relationships" xmlns:m="http://schemas.openxmlformats.org/officeDocument/2006/math" xmlns:v="urn:schemas-microsoft-com:vml" xmlns:wp14="http://schemas.microsoft.com/office/word/2010/wordprocessingDrawing" xmlns:wp="http://schemas.openxmlformats.org/drawingml/2006/wordprocessingDrawing" xmlns:w10="urn:schemas-microsoft-com:office:word" xmlns:w="http://schemas.openxmlformats.org/wordprocessingml/2006/main" xmlns:w14="http://schemas.microsoft.com/office/word/2010/wordml" xmlns:w15="http://schemas.microsoft.com/office/word/2012/wordml" xmlns:w16cei="http://schemas.microsoft.com/office/word/2026/wordml/cei" xmlns:w16cex="http://schemas.microsoft.com/office/word/2018/wordml/cex" xmlns:w16cid="http://schemas.microsoft.com/office/word/2016/wordml/cid" xmlns:w16="http://schemas.microsoft.com/office/word/2018/wordml" xmlns:w16du="http://schemas.microsoft.com/office/word/2023/wordml/word16du" xmlns:w16sdtdh="http://schemas.microsoft.com/office/word/2020/wordml/sdtdatahash" xmlns:w16sdtfl="http://schemas.microsoft.com/office/word/2024/wordml/sdtformatlock" xmlns:w16se="http://schemas.microsoft.com/office/word/2015/wordml/symex" xmlns:wpg="http://schemas.microsoft.com/office/word/2010/wordprocessingGroup" xmlns:wpi="http://schemas.microsoft.com/office/word/2010/wordprocessingInk" xmlns:wne="http://schemas.microsoft.com/office/word/2006/wordml" xmlns:wps="http://schemas.microsoft.com/office/word/2010/wordprocessingShape" mc:Ignorable="w14 w15 w16se w16cid w16 w16cex w16sdtdh w16sdtfl w16du wp14">
   <w:footnote w:type="separator" w:id="-1">
     <w:p>
       <w:r>
@@ -1910,7 +1457,7 @@
 </file>
 
 <file path=word/header1.xml><?xml version="1.0" encoding="utf-8"?>
-<w:hdr xmlns:wpc="http://schemas.microsoft.com/office/word/2010/wordprocessingCanvas" xmlns:cx="http://schemas.microsoft.com/office/drawing/2014/chartex" xmlns:cx1="http://schemas.microsoft.com/office/drawing/2015/9/8/chartex" xmlns:cx2="http://schemas.microsoft.com/office/drawing/2015/10/21/chartex" xmlns:cx3="http://schemas.microsoft.com/office/drawing/2016/5/9/chartex" xmlns:cx4="http://schemas.microsoft.com/office/drawing/2016/5/10/chartex" xmlns:cx5="http://schemas.microsoft.com/office/drawing/2016/5/11/chartex" xmlns:cx6="http://schemas.microsoft.com/office/drawing/2016/5/12/chartex" xmlns:cx7="http://schemas.microsoft.com/office/drawing/2016/5/13/chartex" xmlns:cx8="http://schemas.microsoft.com/office/drawing/2016/5/14/chartex" xmlns:mc="http://schemas.openxmlformats.org/markup-compatibility/2006" xmlns:aink="http://schemas.microsoft.com/office/drawing/2016/ink" xmlns:am3d="http://schemas.microsoft.com/office/drawing/2017/model3d" xmlns:o="urn:schemas-microsoft-com:office:office" xmlns:oel="http://schemas.microsoft.com/office/2019/extlst" xmlns:r="http://schemas.openxmlformats.org/officeDocument/2006/relationships" xmlns:m="http://schemas.openxmlformats.org/officeDocument/2006/math" xmlns:v="urn:schemas-microsoft-com:vml" xmlns:wp14="http://schemas.microsoft.com/office/word/2010/wordprocessingDrawing" xmlns:wp="http://schemas.openxmlformats.org/drawingml/2006/wordprocessingDrawing" xmlns:w10="urn:schemas-microsoft-com:office:word" xmlns:w="http://schemas.openxmlformats.org/wordprocessingml/2006/main" xmlns:w14="http://schemas.microsoft.com/office/word/2010/wordml" xmlns:w15="http://schemas.microsoft.com/office/word/2012/wordml" xmlns:w16cex="http://schemas.microsoft.com/office/word/2018/wordml/cex" xmlns:w16cid="http://schemas.microsoft.com/office/word/2016/wordml/cid" xmlns:w16="http://schemas.microsoft.com/office/word/2018/wordml" xmlns:w16du="http://schemas.microsoft.com/office/word/2023/wordml/word16du" xmlns:w16sdtdh="http://schemas.microsoft.com/office/word/2020/wordml/sdtdatahash" xmlns:w16sdtfl="http://schemas.microsoft.com/office/word/2024/wordml/sdtformatlock" xmlns:w16se="http://schemas.microsoft.com/office/word/2015/wordml/symex" xmlns:wpg="http://schemas.microsoft.com/office/word/2010/wordprocessingGroup" xmlns:wpi="http://schemas.microsoft.com/office/word/2010/wordprocessingInk" xmlns:wne="http://schemas.microsoft.com/office/word/2006/wordml" xmlns:wps="http://schemas.microsoft.com/office/word/2010/wordprocessingShape" mc:Ignorable="w14 w15 w16se w16cid w16 w16cex w16sdtdh w16sdtfl w16du wp14">
+<w:hdr xmlns:wpc="http://schemas.microsoft.com/office/word/2010/wordprocessingCanvas" xmlns:cx="http://schemas.microsoft.com/office/drawing/2014/chartex" xmlns:cx1="http://schemas.microsoft.com/office/drawing/2015/9/8/chartex" xmlns:cx2="http://schemas.microsoft.com/office/drawing/2015/10/21/chartex" xmlns:cx3="http://schemas.microsoft.com/office/drawing/2016/5/9/chartex" xmlns:cx4="http://schemas.microsoft.com/office/drawing/2016/5/10/chartex" xmlns:cx5="http://schemas.microsoft.com/office/drawing/2016/5/11/chartex" xmlns:cx6="http://schemas.microsoft.com/office/drawing/2016/5/12/chartex" xmlns:cx7="http://schemas.microsoft.com/office/drawing/2016/5/13/chartex" xmlns:cx8="http://schemas.microsoft.com/office/drawing/2016/5/14/chartex" xmlns:mc="http://schemas.openxmlformats.org/markup-compatibility/2006" xmlns:aink="http://schemas.microsoft.com/office/drawing/2016/ink" xmlns:am3d="http://schemas.microsoft.com/office/drawing/2017/model3d" xmlns:o="urn:schemas-microsoft-com:office:office" xmlns:oel="http://schemas.microsoft.com/office/2019/extlst" xmlns:r="http://schemas.openxmlformats.org/officeDocument/2006/relationships" xmlns:m="http://schemas.openxmlformats.org/officeDocument/2006/math" xmlns:v="urn:schemas-microsoft-com:vml" xmlns:wp14="http://schemas.microsoft.com/office/word/2010/wordprocessingDrawing" xmlns:wp="http://schemas.openxmlformats.org/drawingml/2006/wordprocessingDrawing" xmlns:w10="urn:schemas-microsoft-com:office:word" xmlns:w="http://schemas.openxmlformats.org/wordprocessingml/2006/main" xmlns:w14="http://schemas.microsoft.com/office/word/2010/wordml" xmlns:w15="http://schemas.microsoft.com/office/word/2012/wordml" xmlns:w16cei="http://schemas.microsoft.com/office/word/2026/wordml/cei" xmlns:w16cex="http://schemas.microsoft.com/office/word/2018/wordml/cex" xmlns:w16cid="http://schemas.microsoft.com/office/word/2016/wordml/cid" xmlns:w16="http://schemas.microsoft.com/office/word/2018/wordml" xmlns:w16du="http://schemas.microsoft.com/office/word/2023/wordml/word16du" xmlns:w16sdtdh="http://schemas.microsoft.com/office/word/2020/wordml/sdtdatahash" xmlns:w16sdtfl="http://schemas.microsoft.com/office/word/2024/wordml/sdtformatlock" xmlns:w16se="http://schemas.microsoft.com/office/word/2015/wordml/symex" xmlns:wpg="http://schemas.microsoft.com/office/word/2010/wordprocessingGroup" xmlns:wpi="http://schemas.microsoft.com/office/word/2010/wordprocessingInk" xmlns:wne="http://schemas.microsoft.com/office/word/2006/wordml" xmlns:wps="http://schemas.microsoft.com/office/word/2010/wordprocessingShape" mc:Ignorable="w14 w15 w16se w16cid w16 w16cex w16sdtdh w16sdtfl w16du wp14">
   <w:p>
     <w:pPr>
       <w:jc w:val="center"/>
@@ -1928,12 +1475,12 @@
 </file>
 
 <file path=word/numbering.xml><?xml version="1.0" encoding="utf-8"?>
-<w:numbering xmlns:wpc="http://schemas.microsoft.com/office/word/2010/wordprocessingCanvas" xmlns:cx="http://schemas.microsoft.com/office/drawing/2014/chartex" xmlns:cx1="http://schemas.microsoft.com/office/drawing/2015/9/8/chartex" xmlns:cx2="http://schemas.microsoft.com/office/drawing/2015/10/21/chartex" xmlns:cx3="http://schemas.microsoft.com/office/drawing/2016/5/9/chartex" xmlns:cx4="http://schemas.microsoft.com/office/drawing/2016/5/10/chartex" xmlns:cx5="http://schemas.microsoft.com/office/drawing/2016/5/11/chartex" xmlns:cx6="http://schemas.microsoft.com/office/drawing/2016/5/12/chartex" xmlns:cx7="http://schemas.microsoft.com/office/drawing/2016/5/13/chartex" xmlns:cx8="http://schemas.microsoft.com/office/drawing/2016/5/14/chartex" xmlns:mc="http://schemas.openxmlformats.org/markup-compatibility/2006" xmlns:aink="http://schemas.microsoft.com/office/drawing/2016/ink" xmlns:am3d="http://schemas.microsoft.com/office/drawing/2017/model3d" xmlns:o="urn:schemas-microsoft-com:office:office" xmlns:oel="http://schemas.microsoft.com/office/2019/extlst" xmlns:r="http://schemas.openxmlformats.org/officeDocument/2006/relationships" xmlns:m="http://schemas.openxmlformats.org/officeDocument/2006/math" xmlns:v="urn:schemas-microsoft-com:vml" xmlns:wp14="http://schemas.microsoft.com/office/word/2010/wordprocessingDrawing" xmlns:wp="http://schemas.openxmlformats.org/drawingml/2006/wordprocessingDrawing" xmlns:w10="urn:schemas-microsoft-com:office:word" xmlns:w="http://schemas.openxmlformats.org/wordprocessingml/2006/main" xmlns:w14="http://schemas.microsoft.com/office/word/2010/wordml" xmlns:w15="http://schemas.microsoft.com/office/word/2012/wordml" xmlns:w16cex="http://schemas.microsoft.com/office/word/2018/wordml/cex" xmlns:w16cid="http://schemas.microsoft.com/office/word/2016/wordml/cid" xmlns:w16="http://schemas.microsoft.com/office/word/2018/wordml" xmlns:w16du="http://schemas.microsoft.com/office/word/2023/wordml/word16du" xmlns:w16sdtdh="http://schemas.microsoft.com/office/word/2020/wordml/sdtdatahash" xmlns:w16sdtfl="http://schemas.microsoft.com/office/word/2024/wordml/sdtformatlock" xmlns:w16se="http://schemas.microsoft.com/office/word/2015/wordml/symex" xmlns:wpg="http://schemas.microsoft.com/office/word/2010/wordprocessingGroup" xmlns:wpi="http://schemas.microsoft.com/office/word/2010/wordprocessingInk" xmlns:wne="http://schemas.microsoft.com/office/word/2006/wordml" xmlns:wps="http://schemas.microsoft.com/office/word/2010/wordprocessingShape" mc:Ignorable="w14 w15 w16se w16cid w16 w16cex w16sdtdh w16sdtfl w16du wp14">
+<w:numbering xmlns:wpc="http://schemas.microsoft.com/office/word/2010/wordprocessingCanvas" xmlns:cx="http://schemas.microsoft.com/office/drawing/2014/chartex" xmlns:cx1="http://schemas.microsoft.com/office/drawing/2015/9/8/chartex" xmlns:cx2="http://schemas.microsoft.com/office/drawing/2015/10/21/chartex" xmlns:cx3="http://schemas.microsoft.com/office/drawing/2016/5/9/chartex" xmlns:cx4="http://schemas.microsoft.com/office/drawing/2016/5/10/chartex" xmlns:cx5="http://schemas.microsoft.com/office/drawing/2016/5/11/chartex" xmlns:cx6="http://schemas.microsoft.com/office/drawing/2016/5/12/chartex" xmlns:cx7="http://schemas.microsoft.com/office/drawing/2016/5/13/chartex" xmlns:cx8="http://schemas.microsoft.com/office/drawing/2016/5/14/chartex" xmlns:mc="http://schemas.openxmlformats.org/markup-compatibility/2006" xmlns:aink="http://schemas.microsoft.com/office/drawing/2016/ink" xmlns:am3d="http://schemas.microsoft.com/office/drawing/2017/model3d" xmlns:o="urn:schemas-microsoft-com:office:office" xmlns:oel="http://schemas.microsoft.com/office/2019/extlst" xmlns:r="http://schemas.openxmlformats.org/officeDocument/2006/relationships" xmlns:m="http://schemas.openxmlformats.org/officeDocument/2006/math" xmlns:v="urn:schemas-microsoft-com:vml" xmlns:wp14="http://schemas.microsoft.com/office/word/2010/wordprocessingDrawing" xmlns:wp="http://schemas.openxmlformats.org/drawingml/2006/wordprocessingDrawing" xmlns:w10="urn:schemas-microsoft-com:office:word" xmlns:w="http://schemas.openxmlformats.org/wordprocessingml/2006/main" xmlns:w14="http://schemas.microsoft.com/office/word/2010/wordml" xmlns:w15="http://schemas.microsoft.com/office/word/2012/wordml" xmlns:w16cei="http://schemas.microsoft.com/office/word/2026/wordml/cei" xmlns:w16cex="http://schemas.microsoft.com/office/word/2018/wordml/cex" xmlns:w16cid="http://schemas.microsoft.com/office/word/2016/wordml/cid" xmlns:w16="http://schemas.microsoft.com/office/word/2018/wordml" xmlns:w16du="http://schemas.microsoft.com/office/word/2023/wordml/word16du" xmlns:w16sdtdh="http://schemas.microsoft.com/office/word/2020/wordml/sdtdatahash" xmlns:w16sdtfl="http://schemas.microsoft.com/office/word/2024/wordml/sdtformatlock" xmlns:w16se="http://schemas.microsoft.com/office/word/2015/wordml/symex" xmlns:wpg="http://schemas.microsoft.com/office/word/2010/wordprocessingGroup" xmlns:wpi="http://schemas.microsoft.com/office/word/2010/wordprocessingInk" xmlns:wne="http://schemas.microsoft.com/office/word/2006/wordml" xmlns:wps="http://schemas.microsoft.com/office/word/2010/wordprocessingShape" mc:Ignorable="w14 w15 w16se w16cid w16 w16cex w16sdtdh w16sdtfl w16du wp14">
   <w:abstractNum w:abstractNumId="0" w15:restartNumberingAfterBreak="0">
-    <w:nsid w:val="49EF12AF"/>
+    <w:nsid w:val="11CD0DCE"/>
     <w:multiLevelType w:val="hybridMultilevel"/>
-    <w:tmpl w:val="D0EEB7F4"/>
-    <w:lvl w:ilvl="0" w:tplc="9618C544">
+    <w:tmpl w:val="63041ED8"/>
+    <w:lvl w:ilvl="0" w:tplc="C8B6A168">
       <w:start w:val="1"/>
       <w:numFmt w:val="bullet"/>
       <w:lvlText w:val="●"/>
@@ -1942,7 +1489,7 @@
         <w:ind w:left="720" w:hanging="360"/>
       </w:pPr>
     </w:lvl>
-    <w:lvl w:ilvl="1" w:tplc="41363AA2">
+    <w:lvl w:ilvl="1" w:tplc="AA0ACA74">
       <w:start w:val="1"/>
       <w:numFmt w:val="bullet"/>
       <w:lvlText w:val="○"/>
@@ -1951,7 +1498,7 @@
         <w:ind w:left="1440" w:hanging="360"/>
       </w:pPr>
     </w:lvl>
-    <w:lvl w:ilvl="2" w:tplc="C792DF6A">
+    <w:lvl w:ilvl="2" w:tplc="3F3A14C8">
       <w:start w:val="1"/>
       <w:numFmt w:val="bullet"/>
       <w:lvlText w:val="■"/>
@@ -1960,7 +1507,7 @@
         <w:ind w:left="2160" w:hanging="360"/>
       </w:pPr>
     </w:lvl>
-    <w:lvl w:ilvl="3" w:tplc="98C89D62">
+    <w:lvl w:ilvl="3" w:tplc="ADE26262">
       <w:start w:val="1"/>
       <w:numFmt w:val="bullet"/>
       <w:lvlText w:val="●"/>
@@ -1969,7 +1516,7 @@
         <w:ind w:left="2880" w:hanging="360"/>
       </w:pPr>
     </w:lvl>
-    <w:lvl w:ilvl="4" w:tplc="5730572A">
+    <w:lvl w:ilvl="4" w:tplc="BAB67460">
       <w:start w:val="1"/>
       <w:numFmt w:val="bullet"/>
       <w:lvlText w:val="○"/>
@@ -1978,7 +1525,7 @@
         <w:ind w:left="3600" w:hanging="360"/>
       </w:pPr>
     </w:lvl>
-    <w:lvl w:ilvl="5" w:tplc="5F50F950">
+    <w:lvl w:ilvl="5" w:tplc="F64A07B8">
       <w:start w:val="1"/>
       <w:numFmt w:val="bullet"/>
       <w:lvlText w:val="■"/>
@@ -1987,7 +1534,7 @@
         <w:ind w:left="4320" w:hanging="360"/>
       </w:pPr>
     </w:lvl>
-    <w:lvl w:ilvl="6" w:tplc="2A623B2C">
+    <w:lvl w:ilvl="6" w:tplc="6720D59C">
       <w:start w:val="1"/>
       <w:numFmt w:val="bullet"/>
       <w:lvlText w:val="●"/>
@@ -1996,7 +1543,7 @@
         <w:ind w:left="5040" w:hanging="360"/>
       </w:pPr>
     </w:lvl>
-    <w:lvl w:ilvl="7" w:tplc="5C94076A">
+    <w:lvl w:ilvl="7" w:tplc="52AC0FEA">
       <w:start w:val="1"/>
       <w:numFmt w:val="bullet"/>
       <w:lvlText w:val="●"/>
@@ -2005,7 +1552,7 @@
         <w:ind w:left="5760" w:hanging="360"/>
       </w:pPr>
     </w:lvl>
-    <w:lvl w:ilvl="8" w:tplc="CA0CE4AE">
+    <w:lvl w:ilvl="8" w:tplc="0772E466">
       <w:start w:val="1"/>
       <w:numFmt w:val="bullet"/>
       <w:lvlText w:val="●"/>
@@ -2015,7 +1562,7 @@
       </w:pPr>
     </w:lvl>
   </w:abstractNum>
-  <w:num w:numId="1" w16cid:durableId="1394504317">
+  <w:num w:numId="1" w16cid:durableId="1886402216">
     <w:abstractNumId w:val="0"/>
     <w:lvlOverride w:ilvl="0">
       <w:startOverride w:val="1"/>
@@ -2030,7 +1577,7 @@
     <w:rPrDefault>
       <w:rPr>
         <w:rFonts w:ascii="Times New Roman" w:eastAsia="Times New Roman" w:hAnsi="Times New Roman" w:cs="Times New Roman"/>
-        <w:lang w:val="en-US" w:eastAsia="en-US" w:bidi="hi-IN"/>
+        <w:lang w:val="en-IN" w:eastAsia="en-IN" w:bidi="ar-SA"/>
       </w:rPr>
     </w:rPrDefault>
     <w:pPrDefault/>
@@ -2626,39 +2173,39 @@
         <a:sysClr val="window" lastClr="FFFFFF"/>
       </a:lt1>
       <a:dk2>
-        <a:srgbClr val="44546A"/>
+        <a:srgbClr val="0E2841"/>
       </a:dk2>
       <a:lt2>
-        <a:srgbClr val="E7E6E6"/>
+        <a:srgbClr val="E8E8E8"/>
       </a:lt2>
       <a:accent1>
-        <a:srgbClr val="4472C4"/>
+        <a:srgbClr val="156082"/>
       </a:accent1>
       <a:accent2>
-        <a:srgbClr val="ED7D31"/>
+        <a:srgbClr val="E97132"/>
       </a:accent2>
       <a:accent3>
-        <a:srgbClr val="A5A5A5"/>
+        <a:srgbClr val="196B24"/>
       </a:accent3>
       <a:accent4>
-        <a:srgbClr val="FFC000"/>
+        <a:srgbClr val="0F9ED5"/>
       </a:accent4>
       <a:accent5>
-        <a:srgbClr val="5B9BD5"/>
+        <a:srgbClr val="A02B93"/>
       </a:accent5>
       <a:accent6>
-        <a:srgbClr val="70AD47"/>
+        <a:srgbClr val="4EA72E"/>
       </a:accent6>
       <a:hlink>
-        <a:srgbClr val="0563C1"/>
+        <a:srgbClr val="467886"/>
       </a:hlink>
       <a:folHlink>
-        <a:srgbClr val="954F72"/>
+        <a:srgbClr val="96607D"/>
       </a:folHlink>
     </a:clrScheme>
     <a:fontScheme name="Office">
       <a:majorFont>
-        <a:latin typeface="Calibri Light" panose="020F0302020204030204"/>
+        <a:latin typeface="Aptos Display" panose="02110004020202020204"/>
         <a:ea typeface=""/>
         <a:cs typeface=""/>
         <a:font script="Jpan" typeface="游ゴシック Light"/>
@@ -2710,7 +2257,7 @@
         <a:font script="Tfng" typeface="Ebrima"/>
       </a:majorFont>
       <a:minorFont>
-        <a:latin typeface="Calibri" panose="020F0502020204030204"/>
+        <a:latin typeface="Aptos" panose="02110004020202020204"/>
         <a:ea typeface=""/>
         <a:cs typeface=""/>
         <a:font script="Jpan" typeface="游明朝"/>
@@ -2821,13 +2368,6 @@
         </a:gradFill>
       </a:fillStyleLst>
       <a:lnStyleLst>
-        <a:ln w="6350" cap="flat" cmpd="sng" algn="ctr">
-          <a:solidFill>
-            <a:schemeClr val="phClr"/>
-          </a:solidFill>
-          <a:prstDash val="solid"/>
-          <a:miter lim="800000"/>
-        </a:ln>
         <a:ln w="12700" cap="flat" cmpd="sng" algn="ctr">
           <a:solidFill>
             <a:schemeClr val="phClr"/>
@@ -2836,6 +2376,13 @@
           <a:miter lim="800000"/>
         </a:ln>
         <a:ln w="19050" cap="flat" cmpd="sng" algn="ctr">
+          <a:solidFill>
+            <a:schemeClr val="phClr"/>
+          </a:solidFill>
+          <a:prstDash val="solid"/>
+          <a:miter lim="800000"/>
+        </a:ln>
+        <a:ln w="25400" cap="flat" cmpd="sng" algn="ctr">
           <a:solidFill>
             <a:schemeClr val="phClr"/>
           </a:solidFill>
@@ -2900,11 +2447,31 @@
       </a:bgFillStyleLst>
     </a:fmtScheme>
   </a:themeElements>
-  <a:objectDefaults/>
+  <a:objectDefaults>
+    <a:lnDef>
+      <a:spPr/>
+      <a:bodyPr/>
+      <a:lstStyle/>
+      <a:style>
+        <a:lnRef idx="2">
+          <a:schemeClr val="accent1"/>
+        </a:lnRef>
+        <a:fillRef idx="0">
+          <a:schemeClr val="accent1"/>
+        </a:fillRef>
+        <a:effectRef idx="1">
+          <a:schemeClr val="accent1"/>
+        </a:effectRef>
+        <a:fontRef idx="minor">
+          <a:schemeClr val="tx1"/>
+        </a:fontRef>
+      </a:style>
+    </a:lnDef>
+  </a:objectDefaults>
   <a:extraClrSchemeLst/>
   <a:extLst>
     <a:ext uri="{05A4C25C-085E-4340-85A3-A5531E510DB2}">
-      <thm15:themeFamily xmlns:thm15="http://schemas.microsoft.com/office/thememl/2012/main" name="Office Theme" id="{62F939B6-93AF-4DB8-9C6B-D6C7DFDC589F}" vid="{4A3C46E8-61CC-4603-A589-7422A47A8E4A}"/>
+      <thm15:themeFamily xmlns:thm15="http://schemas.microsoft.com/office/thememl/2012/main" name="Office Theme" id="{2E142A2C-CD16-42D6-873A-C26D2A0506FA}" vid="{1BDDFF52-6CD6-40A5-AB3C-68EB2F1E4D0A}"/>
     </a:ext>
   </a:extLst>
 </a:theme>

</xml_diff>

<commit_message>
Some modifications in Row May 2026
Some modifications in Row May 2026
</commit_message>
<xml_diff>
--- a/CBI_Supplementary_Letter.docx
+++ b/CBI_Supplementary_Letter.docx
@@ -1,6 +1,6 @@
 
 <file path=word/document.xml><?xml version="1.0" encoding="utf-8"?>
-<w:document xmlns:wpc="http://schemas.microsoft.com/office/word/2010/wordprocessingCanvas" xmlns:cx="http://schemas.microsoft.com/office/drawing/2014/chartex" xmlns:cx1="http://schemas.microsoft.com/office/drawing/2015/9/8/chartex" xmlns:cx2="http://schemas.microsoft.com/office/drawing/2015/10/21/chartex" xmlns:cx3="http://schemas.microsoft.com/office/drawing/2016/5/9/chartex" xmlns:cx4="http://schemas.microsoft.com/office/drawing/2016/5/10/chartex" xmlns:cx5="http://schemas.microsoft.com/office/drawing/2016/5/11/chartex" xmlns:cx6="http://schemas.microsoft.com/office/drawing/2016/5/12/chartex" xmlns:cx7="http://schemas.microsoft.com/office/drawing/2016/5/13/chartex" xmlns:cx8="http://schemas.microsoft.com/office/drawing/2016/5/14/chartex" xmlns:mc="http://schemas.openxmlformats.org/markup-compatibility/2006" xmlns:aink="http://schemas.microsoft.com/office/drawing/2016/ink" xmlns:am3d="http://schemas.microsoft.com/office/drawing/2017/model3d" xmlns:o="urn:schemas-microsoft-com:office:office" xmlns:oel="http://schemas.microsoft.com/office/2019/extlst" xmlns:r="http://schemas.openxmlformats.org/officeDocument/2006/relationships" xmlns:m="http://schemas.openxmlformats.org/officeDocument/2006/math" xmlns:v="urn:schemas-microsoft-com:vml" xmlns:wp14="http://schemas.microsoft.com/office/word/2010/wordprocessingDrawing" xmlns:wp="http://schemas.openxmlformats.org/drawingml/2006/wordprocessingDrawing" xmlns:w10="urn:schemas-microsoft-com:office:word" xmlns:w="http://schemas.openxmlformats.org/wordprocessingml/2006/main" xmlns:w14="http://schemas.microsoft.com/office/word/2010/wordml" xmlns:w15="http://schemas.microsoft.com/office/word/2012/wordml" xmlns:w16cei="http://schemas.microsoft.com/office/word/2026/wordml/cei" xmlns:w16cex="http://schemas.microsoft.com/office/word/2018/wordml/cex" xmlns:w16cid="http://schemas.microsoft.com/office/word/2016/wordml/cid" xmlns:w16="http://schemas.microsoft.com/office/word/2018/wordml" xmlns:w16du="http://schemas.microsoft.com/office/word/2023/wordml/word16du" xmlns:w16sdtdh="http://schemas.microsoft.com/office/word/2020/wordml/sdtdatahash" xmlns:w16sdtfl="http://schemas.microsoft.com/office/word/2024/wordml/sdtformatlock" xmlns:w16se="http://schemas.microsoft.com/office/word/2015/wordml/symex" xmlns:wpg="http://schemas.microsoft.com/office/word/2010/wordprocessingGroup" xmlns:wpi="http://schemas.microsoft.com/office/word/2010/wordprocessingInk" xmlns:wne="http://schemas.microsoft.com/office/word/2006/wordml" xmlns:wps="http://schemas.microsoft.com/office/word/2010/wordprocessingShape" mc:Ignorable="w14 w15 w16se w16cid w16 w16cex w16sdtdh w16sdtfl w16du wp14">
+<w:document xmlns:wpc="http://schemas.microsoft.com/office/word/2010/wordprocessingCanvas" xmlns:cx="http://schemas.microsoft.com/office/drawing/2014/chartex" xmlns:cx1="http://schemas.microsoft.com/office/drawing/2015/9/8/chartex" xmlns:cx2="http://schemas.microsoft.com/office/drawing/2015/10/21/chartex" xmlns:cx3="http://schemas.microsoft.com/office/drawing/2016/5/9/chartex" xmlns:cx4="http://schemas.microsoft.com/office/drawing/2016/5/10/chartex" xmlns:cx5="http://schemas.microsoft.com/office/drawing/2016/5/11/chartex" xmlns:cx6="http://schemas.microsoft.com/office/drawing/2016/5/12/chartex" xmlns:cx7="http://schemas.microsoft.com/office/drawing/2016/5/13/chartex" xmlns:cx8="http://schemas.microsoft.com/office/drawing/2016/5/14/chartex" xmlns:mc="http://schemas.openxmlformats.org/markup-compatibility/2006" xmlns:aink="http://schemas.microsoft.com/office/drawing/2016/ink" xmlns:am3d="http://schemas.microsoft.com/office/drawing/2017/model3d" xmlns:o="urn:schemas-microsoft-com:office:office" xmlns:oel="http://schemas.microsoft.com/office/2019/extlst" xmlns:r="http://schemas.openxmlformats.org/officeDocument/2006/relationships" xmlns:m="http://schemas.openxmlformats.org/officeDocument/2006/math" xmlns:v="urn:schemas-microsoft-com:vml" xmlns:wp14="http://schemas.microsoft.com/office/word/2010/wordprocessingDrawing" xmlns:wp="http://schemas.openxmlformats.org/drawingml/2006/wordprocessingDrawing" xmlns:w10="urn:schemas-microsoft-com:office:word" xmlns:w="http://schemas.openxmlformats.org/wordprocessingml/2006/main" xmlns:w14="http://schemas.microsoft.com/office/word/2010/wordml" xmlns:w15="http://schemas.microsoft.com/office/word/2012/wordml" xmlns:w16cex="http://schemas.microsoft.com/office/word/2018/wordml/cex" xmlns:w16cid="http://schemas.microsoft.com/office/word/2016/wordml/cid" xmlns:w16="http://schemas.microsoft.com/office/word/2018/wordml" xmlns:w16du="http://schemas.microsoft.com/office/word/2023/wordml/word16du" xmlns:w16sdtdh="http://schemas.microsoft.com/office/word/2020/wordml/sdtdatahash" xmlns:w16sdtfl="http://schemas.microsoft.com/office/word/2024/wordml/sdtformatlock" xmlns:w16se="http://schemas.microsoft.com/office/word/2015/wordml/symex" xmlns:wpg="http://schemas.microsoft.com/office/word/2010/wordprocessingGroup" xmlns:wpi="http://schemas.microsoft.com/office/word/2010/wordprocessingInk" xmlns:wne="http://schemas.microsoft.com/office/word/2006/wordml" xmlns:wps="http://schemas.microsoft.com/office/word/2010/wordprocessingShape" mc:Ignorable="w14 w15 w16se w16cid w16 w16cex w16sdtdh w16sdtfl w16du wp14">
   <w:body>
     <w:p>
       <w:pPr>
@@ -190,12 +190,6 @@
         <w:gridCol w:w="7400"/>
       </w:tblGrid>
       <w:tr>
-        <w:tblPrEx>
-          <w:tblCellMar>
-            <w:top w:w="0" w:type="dxa"/>
-            <w:bottom w:w="0" w:type="dxa"/>
-          </w:tblCellMar>
-        </w:tblPrEx>
         <w:trPr>
           <w:tblHeader/>
         </w:trPr>
@@ -249,12 +243,6 @@
         </w:tc>
       </w:tr>
       <w:tr>
-        <w:tblPrEx>
-          <w:tblCellMar>
-            <w:top w:w="0" w:type="dxa"/>
-            <w:bottom w:w="0" w:type="dxa"/>
-          </w:tblCellMar>
-        </w:tblPrEx>
         <w:tc>
           <w:tcPr>
             <w:tcW w:w="2000" w:type="dxa"/>
@@ -295,18 +283,44 @@
                 <w:sz w:val="19"/>
                 <w:szCs w:val="19"/>
               </w:rPr>
-              <w:t>Original complaint filed with EOW Mumbai, CVO Bank of India, and RBI Department of Supervision, documenting Rs. 51+ crore fraud across void mortgages on Government revenue land (R.S. No. 124, Padra) and a struck-off shell company (Shri Maintainance Contract Pvt. Ltd.), based on 37 anomalies across 19 official Government records (Layperson's Forensic Observation Report, Exhibit J-3).</w:t>
+              <w:t xml:space="preserve">Original complaint filed with EOW Mumbai, CVO Bank of India, and RBI Department of Supervision, documenting Rs. 51+ crore fraud across void mortgages on Government revenue land (R.S. No. 124, Padra) and a struck-off shell company (Shri </w:t>
+            </w:r>
+            <w:proofErr w:type="spellStart"/>
+            <w:r>
+              <w:rPr>
+                <w:sz w:val="19"/>
+                <w:szCs w:val="19"/>
+              </w:rPr>
+              <w:t>Maintainance</w:t>
+            </w:r>
+            <w:proofErr w:type="spellEnd"/>
+            <w:r>
+              <w:rPr>
+                <w:sz w:val="19"/>
+                <w:szCs w:val="19"/>
+              </w:rPr>
+              <w:t xml:space="preserve"> Contract </w:t>
+            </w:r>
+            <w:proofErr w:type="spellStart"/>
+            <w:r>
+              <w:rPr>
+                <w:sz w:val="19"/>
+                <w:szCs w:val="19"/>
+              </w:rPr>
+              <w:t>Pvt.</w:t>
+            </w:r>
+            <w:proofErr w:type="spellEnd"/>
+            <w:r>
+              <w:rPr>
+                <w:sz w:val="19"/>
+                <w:szCs w:val="19"/>
+              </w:rPr>
+              <w:t xml:space="preserve"> Ltd.), based on 37 anomalies across 19 official Government records (Layperson's Forensic Observation Report, Exhibit J-3).</w:t>
             </w:r>
           </w:p>
         </w:tc>
       </w:tr>
       <w:tr>
-        <w:tblPrEx>
-          <w:tblCellMar>
-            <w:top w:w="0" w:type="dxa"/>
-            <w:bottom w:w="0" w:type="dxa"/>
-          </w:tblCellMar>
-        </w:tblPrEx>
         <w:tc>
           <w:tcPr>
             <w:tcW w:w="2000" w:type="dxa"/>
@@ -353,12 +367,6 @@
         </w:tc>
       </w:tr>
       <w:tr>
-        <w:tblPrEx>
-          <w:tblCellMar>
-            <w:top w:w="0" w:type="dxa"/>
-            <w:bottom w:w="0" w:type="dxa"/>
-          </w:tblCellMar>
-        </w:tblPrEx>
         <w:tc>
           <w:tcPr>
             <w:tcW w:w="2000" w:type="dxa"/>
@@ -405,12 +413,6 @@
         </w:tc>
       </w:tr>
       <w:tr>
-        <w:tblPrEx>
-          <w:tblCellMar>
-            <w:top w:w="0" w:type="dxa"/>
-            <w:bottom w:w="0" w:type="dxa"/>
-          </w:tblCellMar>
-        </w:tblPrEx>
         <w:tc>
           <w:tcPr>
             <w:tcW w:w="2000" w:type="dxa"/>
@@ -451,7 +453,39 @@
                 <w:sz w:val="19"/>
                 <w:szCs w:val="19"/>
               </w:rPr>
-              <w:t xml:space="preserve">EOW Mumbai formally transferred the entire complaint (59 pages of documents) to CBI Mumbai for further investigation, vide Reference No. 993/VPNI/AJUVI/Unit 7(Shares)/2026, naming Shri Babulal Ganeshmal Bohra, Shri Ravi Babulal Bohra, and unknown officers of Bank of India, Nagpada Branch, </w:t>
+              <w:t xml:space="preserve">EOW Mumbai formally transferred the entire complaint (59 pages of documents) to CBI Mumbai for further investigation, vide Reference No. 993/VPNI/AJUVI/Unit 7(Shares)/2026, naming Shri Babulal </w:t>
+            </w:r>
+            <w:proofErr w:type="spellStart"/>
+            <w:r>
+              <w:rPr>
+                <w:sz w:val="19"/>
+                <w:szCs w:val="19"/>
+              </w:rPr>
+              <w:t>Ganeshmal</w:t>
+            </w:r>
+            <w:proofErr w:type="spellEnd"/>
+            <w:r>
+              <w:rPr>
+                <w:sz w:val="19"/>
+                <w:szCs w:val="19"/>
+              </w:rPr>
+              <w:t xml:space="preserve"> Bohra, Shri Ravi Babulal Bohra, and unknown officers of Bank of India, </w:t>
+            </w:r>
+            <w:proofErr w:type="spellStart"/>
+            <w:r>
+              <w:rPr>
+                <w:sz w:val="19"/>
+                <w:szCs w:val="19"/>
+              </w:rPr>
+              <w:t>Nagpada</w:t>
+            </w:r>
+            <w:proofErr w:type="spellEnd"/>
+            <w:r>
+              <w:rPr>
+                <w:sz w:val="19"/>
+                <w:szCs w:val="19"/>
+              </w:rPr>
+              <w:t xml:space="preserve"> Branch, </w:t>
             </w:r>
             <w:r>
               <w:t>as persons whose conduct is the subject of investigation</w:t>
@@ -467,12 +501,6 @@
         </w:tc>
       </w:tr>
       <w:tr>
-        <w:tblPrEx>
-          <w:tblCellMar>
-            <w:top w:w="0" w:type="dxa"/>
-            <w:bottom w:w="0" w:type="dxa"/>
-          </w:tblCellMar>
-        </w:tblPrEx>
         <w:tc>
           <w:tcPr>
             <w:tcW w:w="2000" w:type="dxa"/>
@@ -520,12 +548,6 @@
         </w:tc>
       </w:tr>
       <w:tr>
-        <w:tblPrEx>
-          <w:tblCellMar>
-            <w:top w:w="0" w:type="dxa"/>
-            <w:bottom w:w="0" w:type="dxa"/>
-          </w:tblCellMar>
-        </w:tblPrEx>
         <w:tc>
           <w:tcPr>
             <w:tcW w:w="2000" w:type="dxa"/>
@@ -566,18 +588,28 @@
                 <w:sz w:val="19"/>
                 <w:szCs w:val="19"/>
               </w:rPr>
-              <w:t>A newly discovered Form CHG-4, filed by Light and Glaze Profile Pvt. Ltd. exactly 33 days after the Complainant's intervention application (IA 884/2026) was filed in DRT-II Mumbai, was found to carry, among seven identified anomalies, no corresponding record of the signing director's cessation from the company at any point in the Registrar of Companies' own filings — notwithstanding that filing being subsequently struck off.</w:t>
+              <w:t xml:space="preserve">A newly discovered Form CHG-4, filed by Light and Glaze Profile </w:t>
+            </w:r>
+            <w:proofErr w:type="spellStart"/>
+            <w:r>
+              <w:rPr>
+                <w:sz w:val="19"/>
+                <w:szCs w:val="19"/>
+              </w:rPr>
+              <w:t>Pvt.</w:t>
+            </w:r>
+            <w:proofErr w:type="spellEnd"/>
+            <w:r>
+              <w:rPr>
+                <w:sz w:val="19"/>
+                <w:szCs w:val="19"/>
+              </w:rPr>
+              <w:t xml:space="preserve"> Ltd. exactly 33 days after the Complainant's intervention application (IA 884/2026) was filed in DRT-II Mumbai, was found to carry, among seven identified anomalies, no corresponding record of the signing director's cessation from the company at any point in the Registrar of Companies' own filings — notwithstanding that filing being subsequently struck off.</w:t>
             </w:r>
           </w:p>
         </w:tc>
       </w:tr>
       <w:tr>
-        <w:tblPrEx>
-          <w:tblCellMar>
-            <w:top w:w="0" w:type="dxa"/>
-            <w:bottom w:w="0" w:type="dxa"/>
-          </w:tblCellMar>
-        </w:tblPrEx>
         <w:tc>
           <w:tcPr>
             <w:tcW w:w="2000" w:type="dxa"/>
@@ -624,12 +656,6 @@
         </w:tc>
       </w:tr>
       <w:tr>
-        <w:tblPrEx>
-          <w:tblCellMar>
-            <w:top w:w="0" w:type="dxa"/>
-            <w:bottom w:w="0" w:type="dxa"/>
-          </w:tblCellMar>
-        </w:tblPrEx>
         <w:tc>
           <w:tcPr>
             <w:tcW w:w="2000" w:type="dxa"/>
@@ -666,22 +692,20 @@
           </w:tcPr>
           <w:p>
             <w:r>
-              <w:rPr>
-                <w:sz w:val="19"/>
-                <w:szCs w:val="19"/>
-              </w:rPr>
-              <w:t>Discovery of a parallel fraud pattern at Bank of Baroda: CERSAI Asset ID 200028262710, concerning M/s S.G. Preservatives, showed an identical void-mortgage methodology on Government revenue land (Survey 885/886, Asoj Village) with valuation inflated by approximately 700%, revising the Complainant's documented total fraud quantum upward to Rs. 76.87 crore across three public sector banks.</w:t>
+              <w:t xml:space="preserve">Discovery of a parallel exposure pattern at Bank of Baroda: CERSAI Asset ID 200028262710, concerning M/s S.G. Preservatives, secured against an asset (Survey 885/886, </w:t>
+            </w:r>
+            <w:proofErr w:type="spellStart"/>
+            <w:r>
+              <w:t>Asoj</w:t>
+            </w:r>
+            <w:proofErr w:type="spellEnd"/>
+            <w:r>
+              <w:t xml:space="preserve"> Village) where the registered owner is a party distinct from the borrowing company. Bank of Baroda's own CERSAI filing records the secured value on this asset increasing from Rs. 22.00 crore (14.03.2019) to Rs. 25.16 crore (29.03.2022), with charge status remaining NOT SATISFIED throughout — revising the Complainant's documented total fraud quantum upward to Rs. 76.87 crore across three public sector banks.</w:t>
             </w:r>
           </w:p>
         </w:tc>
       </w:tr>
       <w:tr>
-        <w:tblPrEx>
-          <w:tblCellMar>
-            <w:top w:w="0" w:type="dxa"/>
-            <w:bottom w:w="0" w:type="dxa"/>
-          </w:tblCellMar>
-        </w:tblPrEx>
         <w:tc>
           <w:tcPr>
             <w:tcW w:w="2000" w:type="dxa"/>
@@ -728,12 +752,6 @@
         </w:tc>
       </w:tr>
       <w:tr>
-        <w:tblPrEx>
-          <w:tblCellMar>
-            <w:top w:w="0" w:type="dxa"/>
-            <w:bottom w:w="0" w:type="dxa"/>
-          </w:tblCellMar>
-        </w:tblPrEx>
         <w:tc>
           <w:tcPr>
             <w:tcW w:w="2000" w:type="dxa"/>
@@ -780,12 +798,6 @@
         </w:tc>
       </w:tr>
       <w:tr>
-        <w:tblPrEx>
-          <w:tblCellMar>
-            <w:top w:w="0" w:type="dxa"/>
-            <w:bottom w:w="0" w:type="dxa"/>
-          </w:tblCellMar>
-        </w:tblPrEx>
         <w:tc>
           <w:tcPr>
             <w:tcW w:w="2000" w:type="dxa"/>
@@ -832,12 +844,6 @@
         </w:tc>
       </w:tr>
       <w:tr>
-        <w:tblPrEx>
-          <w:tblCellMar>
-            <w:top w:w="0" w:type="dxa"/>
-            <w:bottom w:w="0" w:type="dxa"/>
-          </w:tblCellMar>
-        </w:tblPrEx>
         <w:tc>
           <w:tcPr>
             <w:tcW w:w="2000" w:type="dxa"/>
@@ -884,12 +890,6 @@
         </w:tc>
       </w:tr>
       <w:tr>
-        <w:tblPrEx>
-          <w:tblCellMar>
-            <w:top w:w="0" w:type="dxa"/>
-            <w:bottom w:w="0" w:type="dxa"/>
-          </w:tblCellMar>
-        </w:tblPrEx>
         <w:tc>
           <w:tcPr>
             <w:tcW w:w="2000" w:type="dxa"/>
@@ -930,18 +930,60 @@
                 <w:sz w:val="19"/>
                 <w:szCs w:val="19"/>
               </w:rPr>
-              <w:t>Rashmi Metasteel Private Limited's Form 23AC (statutory filing with the Registrar of Companies) independently confirmed that Shri Ravi Babulal Bohra was a director of this entity as well, that it held zero fixed assets and zero inventory, and that its entire funding was sourced from 100% related-party borrowings — the same pattern already documented for Shri Maintainance Contract Pvt. Ltd.</w:t>
+              <w:t xml:space="preserve">Rashmi </w:t>
+            </w:r>
+            <w:proofErr w:type="spellStart"/>
+            <w:r>
+              <w:rPr>
+                <w:sz w:val="19"/>
+                <w:szCs w:val="19"/>
+              </w:rPr>
+              <w:t>Metasteel</w:t>
+            </w:r>
+            <w:proofErr w:type="spellEnd"/>
+            <w:r>
+              <w:rPr>
+                <w:sz w:val="19"/>
+                <w:szCs w:val="19"/>
+              </w:rPr>
+              <w:t xml:space="preserve"> Private Limited's Form 23AC (statutory filing with the Registrar of Companies) independently confirmed that Shri Ravi Babulal Bohra was a director of this entity as well, that it held zero fixed assets and zero inventory, and that its entire funding was sourced from 100% related-party borrowings — the same pattern already documented for Shri </w:t>
+            </w:r>
+            <w:proofErr w:type="spellStart"/>
+            <w:r>
+              <w:rPr>
+                <w:sz w:val="19"/>
+                <w:szCs w:val="19"/>
+              </w:rPr>
+              <w:t>Maintainance</w:t>
+            </w:r>
+            <w:proofErr w:type="spellEnd"/>
+            <w:r>
+              <w:rPr>
+                <w:sz w:val="19"/>
+                <w:szCs w:val="19"/>
+              </w:rPr>
+              <w:t xml:space="preserve"> Contract </w:t>
+            </w:r>
+            <w:proofErr w:type="spellStart"/>
+            <w:r>
+              <w:rPr>
+                <w:sz w:val="19"/>
+                <w:szCs w:val="19"/>
+              </w:rPr>
+              <w:t>Pvt.</w:t>
+            </w:r>
+            <w:proofErr w:type="spellEnd"/>
+            <w:r>
+              <w:rPr>
+                <w:sz w:val="19"/>
+                <w:szCs w:val="19"/>
+              </w:rPr>
+              <w:t xml:space="preserve"> Ltd.</w:t>
             </w:r>
           </w:p>
         </w:tc>
       </w:tr>
       <w:tr>
-        <w:tblPrEx>
-          <w:tblCellMar>
-            <w:top w:w="0" w:type="dxa"/>
-            <w:bottom w:w="0" w:type="dxa"/>
-          </w:tblCellMar>
-        </w:tblPrEx>
         <w:tc>
           <w:tcPr>
             <w:tcW w:w="2000" w:type="dxa"/>
@@ -982,18 +1024,28 @@
                 <w:sz w:val="19"/>
                 <w:szCs w:val="19"/>
               </w:rPr>
-              <w:t>Independent RTI inquiries confirmed Rashmi Metasteel Private Limited was never registered as a factory anywhere in the State of Maharashtra, and that its declared business address on C.P. Tank Road, Mumbai, is a virtual office — despite the entity having been represented to lending institutions as an operating steel enterprise.</w:t>
+              <w:t xml:space="preserve">Independent RTI inquiries confirmed Rashmi </w:t>
+            </w:r>
+            <w:proofErr w:type="spellStart"/>
+            <w:r>
+              <w:rPr>
+                <w:sz w:val="19"/>
+                <w:szCs w:val="19"/>
+              </w:rPr>
+              <w:t>Metasteel</w:t>
+            </w:r>
+            <w:proofErr w:type="spellEnd"/>
+            <w:r>
+              <w:rPr>
+                <w:sz w:val="19"/>
+                <w:szCs w:val="19"/>
+              </w:rPr>
+              <w:t xml:space="preserve"> Private Limited was never registered as a factory anywhere in the State of Maharashtra, and that its declared business address on C.P. Tank Road, Mumbai, is a virtual office — despite the entity having been represented to lending institutions as an operating steel enterprise.</w:t>
             </w:r>
           </w:p>
         </w:tc>
       </w:tr>
       <w:tr>
-        <w:tblPrEx>
-          <w:tblCellMar>
-            <w:top w:w="0" w:type="dxa"/>
-            <w:bottom w:w="0" w:type="dxa"/>
-          </w:tblCellMar>
-        </w:tblPrEx>
         <w:tc>
           <w:tcPr>
             <w:tcW w:w="2000" w:type="dxa"/>
@@ -1065,15 +1117,8 @@
           <w:sz w:val="22"/>
           <w:szCs w:val="22"/>
         </w:rPr>
-        <w:t xml:space="preserve">1. The CERSAI record for the original Indian Overseas Bank charge on R.S. No. 124, Padra, continues to show “NOT SATISFIED” as of 20.05.2026 — more than thirteen years after registration — despite the same property </w:t>
-      </w:r>
-      <w:r>
-        <w:rPr>
-          <w:sz w:val="22"/>
-          <w:szCs w:val="22"/>
-        </w:rPr>
         <w:lastRenderedPageBreak/>
-        <w:t>having subsequently been offered as security to two further public sector banks. This is independently verifiable on the CERSAI public portal and requires no further corroboration from the Complainant.</w:t>
+        <w:t>1. The CERSAI record for the original Indian Overseas Bank charge on R.S. No. 124, Padra, continues to show “NOT SATISFIED” as of 20.05.2026 — more than thirteen years after registration — despite the same property having subsequently been offered as security to two further public sector banks. This is independently verifiable on the CERSAI public portal and requires no further corroboration from the Complainant.</w:t>
       </w:r>
     </w:p>
     <w:p>
@@ -1086,7 +1131,23 @@
           <w:sz w:val="22"/>
           <w:szCs w:val="22"/>
         </w:rPr>
-        <w:t xml:space="preserve">2. The Form CHG-4 filed by Light and Glaze Profile Pvt. Ltd. was signed, as Director, by Shri Srinivas Saikumar Anne, against a satisfaction date of 19.10.2015. The Registrar of Companies' record for Light and Glaze does not, on its face, evidence any Form DIR-12 or comparable record of Mr. Anne's cessation as Director of that company at any point. The Complainant does not assert a confirmed resignation date on this record </w:t>
+        <w:t xml:space="preserve">2. The Form CHG-4 filed by Light and Glaze Profile </w:t>
+      </w:r>
+      <w:proofErr w:type="spellStart"/>
+      <w:r>
+        <w:rPr>
+          <w:sz w:val="22"/>
+          <w:szCs w:val="22"/>
+        </w:rPr>
+        <w:t>Pvt.</w:t>
+      </w:r>
+      <w:proofErr w:type="spellEnd"/>
+      <w:r>
+        <w:rPr>
+          <w:sz w:val="22"/>
+          <w:szCs w:val="22"/>
+        </w:rPr>
+        <w:t xml:space="preserve"> Ltd. was signed, as Director, by Shri Srinivas Saikumar Anne, against a satisfaction date of 19.10.2015. The Registrar of Companies' record for Light and Glaze does not, on its face, evidence any Form DIR-12 or comparable record of Mr. Anne's cessation as Director of that company at any point. The Complainant does not assert a confirmed resignation date on this record </w:t>
       </w:r>
       <w:proofErr w:type="gramStart"/>
       <w:r>
@@ -1157,7 +1218,55 @@
           <w:sz w:val="22"/>
           <w:szCs w:val="22"/>
         </w:rPr>
-        <w:t xml:space="preserve">5. The RoC-certified Form 23AC of Rashmi Metasteel Pvt. Ltd. for FY 2012-13, signed by Ravi Babulal Bohra as Director on 05.09.2013, independently confirms: (a) zero tangible fixed assets of any kind; (b) zero operating income; (c) technical insolvency — accumulated losses of Rs. 22,75,814 against paid-up capital of Rs. 10,00,000; and (d) 100% of long-term borrowings — Rs. 23,861,026 — sourced exclusively from related parties, with zero from any bank or independent lender. This document was publicly available on the MCA portal at the time Bank of India sanctioned Rs. 6 </w:t>
+        <w:t xml:space="preserve">5. The </w:t>
+      </w:r>
+      <w:proofErr w:type="spellStart"/>
+      <w:r>
+        <w:rPr>
+          <w:sz w:val="22"/>
+          <w:szCs w:val="22"/>
+        </w:rPr>
+        <w:t>RoC</w:t>
+      </w:r>
+      <w:proofErr w:type="spellEnd"/>
+      <w:r>
+        <w:rPr>
+          <w:sz w:val="22"/>
+          <w:szCs w:val="22"/>
+        </w:rPr>
+        <w:t xml:space="preserve">-certified Form 23AC of Rashmi </w:t>
+      </w:r>
+      <w:proofErr w:type="spellStart"/>
+      <w:r>
+        <w:rPr>
+          <w:sz w:val="22"/>
+          <w:szCs w:val="22"/>
+        </w:rPr>
+        <w:t>Metasteel</w:t>
+      </w:r>
+      <w:proofErr w:type="spellEnd"/>
+      <w:r>
+        <w:rPr>
+          <w:sz w:val="22"/>
+          <w:szCs w:val="22"/>
+        </w:rPr>
+        <w:t xml:space="preserve"> </w:t>
+      </w:r>
+      <w:proofErr w:type="spellStart"/>
+      <w:r>
+        <w:rPr>
+          <w:sz w:val="22"/>
+          <w:szCs w:val="22"/>
+        </w:rPr>
+        <w:t>Pvt.</w:t>
+      </w:r>
+      <w:proofErr w:type="spellEnd"/>
+      <w:r>
+        <w:rPr>
+          <w:sz w:val="22"/>
+          <w:szCs w:val="22"/>
+        </w:rPr>
+        <w:t xml:space="preserve"> Ltd. for FY 2012-13, signed by Ravi Babulal Bohra as Director on 05.09.2013, independently confirms: (a) zero tangible fixed assets of any kind; (b) zero operating income; (c) technical insolvency — accumulated losses of Rs. 22,75,814 against paid-up capital of Rs. 10,00,000; and (d) 100% of long-term borrowings — Rs. 23,861,026 — sourced exclusively from related parties, with zero from any bank or independent lender. This document was publicly available on the MCA portal at the time Bank of India sanctioned Rs. 6 </w:t>
       </w:r>
       <w:proofErr w:type="gramStart"/>
       <w:r>
@@ -1212,7 +1321,7 @@
           <w:sz w:val="22"/>
           <w:szCs w:val="22"/>
         </w:rPr>
-        <w:t xml:space="preserve">Six illustrative diagrams summarising the fraud network, its methodology, the timeline of events, and the regulatory violations are enclosed with this letter as visual aids for the Investigating Officer's reference. These diagrams are derived entirely from official government records and certified court documents — they do not constitute primary evidence but are intended to assist the investigation in comprehending the scheme quickly: (1) Act 1 — Shell Network Setup; (2) Act 2 — Void Mortgage and False Satisfaction; (3) Act 3 — Coordinated </w:t>
+        <w:t xml:space="preserve">Six illustrative diagrams summarising the fraud network, its methodology, the timeline of events, and the regulatory violations are enclosed with this letter as visual aids for the Investigating Officer's reference. These diagrams are derived entirely from official government records and certified court documents — they do not constitute primary evidence but are intended to assist the investigation in comprehending the scheme quickly: </w:t>
       </w:r>
       <w:r>
         <w:rPr>
@@ -1220,7 +1329,7 @@
           <w:szCs w:val="22"/>
         </w:rPr>
         <w:lastRenderedPageBreak/>
-        <w:t>Credit Extraction; (4) Act 4 — Coordinated Default and Disappearance; (5) Act 5 — Institutional Silence; (6) Act 6 — The Reckoning, 25.08.2026.</w:t>
+        <w:t>(1) Act 1 — Shell Network Setup; (2) Act 2 — Void Mortgage and False Satisfaction; (3) Act 3 — Coordinated Credit Extraction; (4) Act 4 — Coordinated Default and Disappearance; (5) Act 5 — Institutional Silence; (6) Act 6 — The Reckoning, 25.08.2026.</w:t>
       </w:r>
     </w:p>
     <w:p>
@@ -1311,7 +1420,7 @@
 </file>
 
 <file path=word/endnotes.xml><?xml version="1.0" encoding="utf-8"?>
-<w:endnotes xmlns:wpc="http://schemas.microsoft.com/office/word/2010/wordprocessingCanvas" xmlns:cx="http://schemas.microsoft.com/office/drawing/2014/chartex" xmlns:cx1="http://schemas.microsoft.com/office/drawing/2015/9/8/chartex" xmlns:cx2="http://schemas.microsoft.com/office/drawing/2015/10/21/chartex" xmlns:cx3="http://schemas.microsoft.com/office/drawing/2016/5/9/chartex" xmlns:cx4="http://schemas.microsoft.com/office/drawing/2016/5/10/chartex" xmlns:cx5="http://schemas.microsoft.com/office/drawing/2016/5/11/chartex" xmlns:cx6="http://schemas.microsoft.com/office/drawing/2016/5/12/chartex" xmlns:cx7="http://schemas.microsoft.com/office/drawing/2016/5/13/chartex" xmlns:cx8="http://schemas.microsoft.com/office/drawing/2016/5/14/chartex" xmlns:mc="http://schemas.openxmlformats.org/markup-compatibility/2006" xmlns:aink="http://schemas.microsoft.com/office/drawing/2016/ink" xmlns:am3d="http://schemas.microsoft.com/office/drawing/2017/model3d" xmlns:o="urn:schemas-microsoft-com:office:office" xmlns:oel="http://schemas.microsoft.com/office/2019/extlst" xmlns:r="http://schemas.openxmlformats.org/officeDocument/2006/relationships" xmlns:m="http://schemas.openxmlformats.org/officeDocument/2006/math" xmlns:v="urn:schemas-microsoft-com:vml" xmlns:wp14="http://schemas.microsoft.com/office/word/2010/wordprocessingDrawing" xmlns:wp="http://schemas.openxmlformats.org/drawingml/2006/wordprocessingDrawing" xmlns:w10="urn:schemas-microsoft-com:office:word" xmlns:w="http://schemas.openxmlformats.org/wordprocessingml/2006/main" xmlns:w14="http://schemas.microsoft.com/office/word/2010/wordml" xmlns:w15="http://schemas.microsoft.com/office/word/2012/wordml" xmlns:w16cei="http://schemas.microsoft.com/office/word/2026/wordml/cei" xmlns:w16cex="http://schemas.microsoft.com/office/word/2018/wordml/cex" xmlns:w16cid="http://schemas.microsoft.com/office/word/2016/wordml/cid" xmlns:w16="http://schemas.microsoft.com/office/word/2018/wordml" xmlns:w16du="http://schemas.microsoft.com/office/word/2023/wordml/word16du" xmlns:w16sdtdh="http://schemas.microsoft.com/office/word/2020/wordml/sdtdatahash" xmlns:w16sdtfl="http://schemas.microsoft.com/office/word/2024/wordml/sdtformatlock" xmlns:w16se="http://schemas.microsoft.com/office/word/2015/wordml/symex" xmlns:wpg="http://schemas.microsoft.com/office/word/2010/wordprocessingGroup" xmlns:wpi="http://schemas.microsoft.com/office/word/2010/wordprocessingInk" xmlns:wne="http://schemas.microsoft.com/office/word/2006/wordml" xmlns:wps="http://schemas.microsoft.com/office/word/2010/wordprocessingShape" mc:Ignorable="w14 w15 w16se w16cid w16 w16cex w16sdtdh w16sdtfl w16du wp14">
+<w:endnotes xmlns:wpc="http://schemas.microsoft.com/office/word/2010/wordprocessingCanvas" xmlns:cx="http://schemas.microsoft.com/office/drawing/2014/chartex" xmlns:cx1="http://schemas.microsoft.com/office/drawing/2015/9/8/chartex" xmlns:cx2="http://schemas.microsoft.com/office/drawing/2015/10/21/chartex" xmlns:cx3="http://schemas.microsoft.com/office/drawing/2016/5/9/chartex" xmlns:cx4="http://schemas.microsoft.com/office/drawing/2016/5/10/chartex" xmlns:cx5="http://schemas.microsoft.com/office/drawing/2016/5/11/chartex" xmlns:cx6="http://schemas.microsoft.com/office/drawing/2016/5/12/chartex" xmlns:cx7="http://schemas.microsoft.com/office/drawing/2016/5/13/chartex" xmlns:cx8="http://schemas.microsoft.com/office/drawing/2016/5/14/chartex" xmlns:mc="http://schemas.openxmlformats.org/markup-compatibility/2006" xmlns:aink="http://schemas.microsoft.com/office/drawing/2016/ink" xmlns:am3d="http://schemas.microsoft.com/office/drawing/2017/model3d" xmlns:o="urn:schemas-microsoft-com:office:office" xmlns:oel="http://schemas.microsoft.com/office/2019/extlst" xmlns:r="http://schemas.openxmlformats.org/officeDocument/2006/relationships" xmlns:m="http://schemas.openxmlformats.org/officeDocument/2006/math" xmlns:v="urn:schemas-microsoft-com:vml" xmlns:wp14="http://schemas.microsoft.com/office/word/2010/wordprocessingDrawing" xmlns:wp="http://schemas.openxmlformats.org/drawingml/2006/wordprocessingDrawing" xmlns:w10="urn:schemas-microsoft-com:office:word" xmlns:w="http://schemas.openxmlformats.org/wordprocessingml/2006/main" xmlns:w14="http://schemas.microsoft.com/office/word/2010/wordml" xmlns:w15="http://schemas.microsoft.com/office/word/2012/wordml" xmlns:w16cex="http://schemas.microsoft.com/office/word/2018/wordml/cex" xmlns:w16cid="http://schemas.microsoft.com/office/word/2016/wordml/cid" xmlns:w16="http://schemas.microsoft.com/office/word/2018/wordml" xmlns:w16du="http://schemas.microsoft.com/office/word/2023/wordml/word16du" xmlns:w16sdtdh="http://schemas.microsoft.com/office/word/2020/wordml/sdtdatahash" xmlns:w16sdtfl="http://schemas.microsoft.com/office/word/2024/wordml/sdtformatlock" xmlns:w16se="http://schemas.microsoft.com/office/word/2015/wordml/symex" xmlns:wpg="http://schemas.microsoft.com/office/word/2010/wordprocessingGroup" xmlns:wpi="http://schemas.microsoft.com/office/word/2010/wordprocessingInk" xmlns:wne="http://schemas.microsoft.com/office/word/2006/wordml" xmlns:wps="http://schemas.microsoft.com/office/word/2010/wordprocessingShape" mc:Ignorable="w14 w15 w16se w16cid w16 w16cex w16sdtdh w16sdtfl w16du wp14">
   <w:endnote w:type="separator" w:id="-1">
     <w:p>
       <w:r>
@@ -1330,7 +1439,7 @@
 </file>
 
 <file path=word/footer1.xml><?xml version="1.0" encoding="utf-8"?>
-<w:ftr xmlns:wpc="http://schemas.microsoft.com/office/word/2010/wordprocessingCanvas" xmlns:cx="http://schemas.microsoft.com/office/drawing/2014/chartex" xmlns:cx1="http://schemas.microsoft.com/office/drawing/2015/9/8/chartex" xmlns:cx2="http://schemas.microsoft.com/office/drawing/2015/10/21/chartex" xmlns:cx3="http://schemas.microsoft.com/office/drawing/2016/5/9/chartex" xmlns:cx4="http://schemas.microsoft.com/office/drawing/2016/5/10/chartex" xmlns:cx5="http://schemas.microsoft.com/office/drawing/2016/5/11/chartex" xmlns:cx6="http://schemas.microsoft.com/office/drawing/2016/5/12/chartex" xmlns:cx7="http://schemas.microsoft.com/office/drawing/2016/5/13/chartex" xmlns:cx8="http://schemas.microsoft.com/office/drawing/2016/5/14/chartex" xmlns:mc="http://schemas.openxmlformats.org/markup-compatibility/2006" xmlns:aink="http://schemas.microsoft.com/office/drawing/2016/ink" xmlns:am3d="http://schemas.microsoft.com/office/drawing/2017/model3d" xmlns:o="urn:schemas-microsoft-com:office:office" xmlns:oel="http://schemas.microsoft.com/office/2019/extlst" xmlns:r="http://schemas.openxmlformats.org/officeDocument/2006/relationships" xmlns:m="http://schemas.openxmlformats.org/officeDocument/2006/math" xmlns:v="urn:schemas-microsoft-com:vml" xmlns:wp14="http://schemas.microsoft.com/office/word/2010/wordprocessingDrawing" xmlns:wp="http://schemas.openxmlformats.org/drawingml/2006/wordprocessingDrawing" xmlns:w10="urn:schemas-microsoft-com:office:word" xmlns:w="http://schemas.openxmlformats.org/wordprocessingml/2006/main" xmlns:w14="http://schemas.microsoft.com/office/word/2010/wordml" xmlns:w15="http://schemas.microsoft.com/office/word/2012/wordml" xmlns:w16cei="http://schemas.microsoft.com/office/word/2026/wordml/cei" xmlns:w16cex="http://schemas.microsoft.com/office/word/2018/wordml/cex" xmlns:w16cid="http://schemas.microsoft.com/office/word/2016/wordml/cid" xmlns:w16="http://schemas.microsoft.com/office/word/2018/wordml" xmlns:w16du="http://schemas.microsoft.com/office/word/2023/wordml/word16du" xmlns:w16sdtdh="http://schemas.microsoft.com/office/word/2020/wordml/sdtdatahash" xmlns:w16sdtfl="http://schemas.microsoft.com/office/word/2024/wordml/sdtformatlock" xmlns:w16se="http://schemas.microsoft.com/office/word/2015/wordml/symex" xmlns:wpg="http://schemas.microsoft.com/office/word/2010/wordprocessingGroup" xmlns:wpi="http://schemas.microsoft.com/office/word/2010/wordprocessingInk" xmlns:wne="http://schemas.microsoft.com/office/word/2006/wordml" xmlns:wps="http://schemas.microsoft.com/office/word/2010/wordprocessingShape" mc:Ignorable="w14 w15 w16se w16cid w16 w16cex w16sdtdh w16sdtfl w16du wp14">
+<w:ftr xmlns:wpc="http://schemas.microsoft.com/office/word/2010/wordprocessingCanvas" xmlns:cx="http://schemas.microsoft.com/office/drawing/2014/chartex" xmlns:cx1="http://schemas.microsoft.com/office/drawing/2015/9/8/chartex" xmlns:cx2="http://schemas.microsoft.com/office/drawing/2015/10/21/chartex" xmlns:cx3="http://schemas.microsoft.com/office/drawing/2016/5/9/chartex" xmlns:cx4="http://schemas.microsoft.com/office/drawing/2016/5/10/chartex" xmlns:cx5="http://schemas.microsoft.com/office/drawing/2016/5/11/chartex" xmlns:cx6="http://schemas.microsoft.com/office/drawing/2016/5/12/chartex" xmlns:cx7="http://schemas.microsoft.com/office/drawing/2016/5/13/chartex" xmlns:cx8="http://schemas.microsoft.com/office/drawing/2016/5/14/chartex" xmlns:mc="http://schemas.openxmlformats.org/markup-compatibility/2006" xmlns:aink="http://schemas.microsoft.com/office/drawing/2016/ink" xmlns:am3d="http://schemas.microsoft.com/office/drawing/2017/model3d" xmlns:o="urn:schemas-microsoft-com:office:office" xmlns:oel="http://schemas.microsoft.com/office/2019/extlst" xmlns:r="http://schemas.openxmlformats.org/officeDocument/2006/relationships" xmlns:m="http://schemas.openxmlformats.org/officeDocument/2006/math" xmlns:v="urn:schemas-microsoft-com:vml" xmlns:wp14="http://schemas.microsoft.com/office/word/2010/wordprocessingDrawing" xmlns:wp="http://schemas.openxmlformats.org/drawingml/2006/wordprocessingDrawing" xmlns:w10="urn:schemas-microsoft-com:office:word" xmlns:w="http://schemas.openxmlformats.org/wordprocessingml/2006/main" xmlns:w14="http://schemas.microsoft.com/office/word/2010/wordml" xmlns:w15="http://schemas.microsoft.com/office/word/2012/wordml" xmlns:w16cex="http://schemas.microsoft.com/office/word/2018/wordml/cex" xmlns:w16cid="http://schemas.microsoft.com/office/word/2016/wordml/cid" xmlns:w16="http://schemas.microsoft.com/office/word/2018/wordml" xmlns:w16du="http://schemas.microsoft.com/office/word/2023/wordml/word16du" xmlns:w16sdtdh="http://schemas.microsoft.com/office/word/2020/wordml/sdtdatahash" xmlns:w16sdtfl="http://schemas.microsoft.com/office/word/2024/wordml/sdtformatlock" xmlns:w16se="http://schemas.microsoft.com/office/word/2015/wordml/symex" xmlns:wpg="http://schemas.microsoft.com/office/word/2010/wordprocessingGroup" xmlns:wpi="http://schemas.microsoft.com/office/word/2010/wordprocessingInk" xmlns:wne="http://schemas.microsoft.com/office/word/2006/wordml" xmlns:wps="http://schemas.microsoft.com/office/word/2010/wordprocessingShape" mc:Ignorable="w14 w15 w16se w16cid w16 w16cex w16sdtdh w16sdtfl w16du wp14">
   <w:p>
     <w:pPr>
       <w:jc w:val="right"/>
@@ -1438,7 +1547,7 @@
 </file>
 
 <file path=word/footnotes.xml><?xml version="1.0" encoding="utf-8"?>
-<w:footnotes xmlns:wpc="http://schemas.microsoft.com/office/word/2010/wordprocessingCanvas" xmlns:cx="http://schemas.microsoft.com/office/drawing/2014/chartex" xmlns:cx1="http://schemas.microsoft.com/office/drawing/2015/9/8/chartex" xmlns:cx2="http://schemas.microsoft.com/office/drawing/2015/10/21/chartex" xmlns:cx3="http://schemas.microsoft.com/office/drawing/2016/5/9/chartex" xmlns:cx4="http://schemas.microsoft.com/office/drawing/2016/5/10/chartex" xmlns:cx5="http://schemas.microsoft.com/office/drawing/2016/5/11/chartex" xmlns:cx6="http://schemas.microsoft.com/office/drawing/2016/5/12/chartex" xmlns:cx7="http://schemas.microsoft.com/office/drawing/2016/5/13/chartex" xmlns:cx8="http://schemas.microsoft.com/office/drawing/2016/5/14/chartex" xmlns:mc="http://schemas.openxmlformats.org/markup-compatibility/2006" xmlns:aink="http://schemas.microsoft.com/office/drawing/2016/ink" xmlns:am3d="http://schemas.microsoft.com/office/drawing/2017/model3d" xmlns:o="urn:schemas-microsoft-com:office:office" xmlns:oel="http://schemas.microsoft.com/office/2019/extlst" xmlns:r="http://schemas.openxmlformats.org/officeDocument/2006/relationships" xmlns:m="http://schemas.openxmlformats.org/officeDocument/2006/math" xmlns:v="urn:schemas-microsoft-com:vml" xmlns:wp14="http://schemas.microsoft.com/office/word/2010/wordprocessingDrawing" xmlns:wp="http://schemas.openxmlformats.org/drawingml/2006/wordprocessingDrawing" xmlns:w10="urn:schemas-microsoft-com:office:word" xmlns:w="http://schemas.openxmlformats.org/wordprocessingml/2006/main" xmlns:w14="http://schemas.microsoft.com/office/word/2010/wordml" xmlns:w15="http://schemas.microsoft.com/office/word/2012/wordml" xmlns:w16cei="http://schemas.microsoft.com/office/word/2026/wordml/cei" xmlns:w16cex="http://schemas.microsoft.com/office/word/2018/wordml/cex" xmlns:w16cid="http://schemas.microsoft.com/office/word/2016/wordml/cid" xmlns:w16="http://schemas.microsoft.com/office/word/2018/wordml" xmlns:w16du="http://schemas.microsoft.com/office/word/2023/wordml/word16du" xmlns:w16sdtdh="http://schemas.microsoft.com/office/word/2020/wordml/sdtdatahash" xmlns:w16sdtfl="http://schemas.microsoft.com/office/word/2024/wordml/sdtformatlock" xmlns:w16se="http://schemas.microsoft.com/office/word/2015/wordml/symex" xmlns:wpg="http://schemas.microsoft.com/office/word/2010/wordprocessingGroup" xmlns:wpi="http://schemas.microsoft.com/office/word/2010/wordprocessingInk" xmlns:wne="http://schemas.microsoft.com/office/word/2006/wordml" xmlns:wps="http://schemas.microsoft.com/office/word/2010/wordprocessingShape" mc:Ignorable="w14 w15 w16se w16cid w16 w16cex w16sdtdh w16sdtfl w16du wp14">
+<w:footnotes xmlns:wpc="http://schemas.microsoft.com/office/word/2010/wordprocessingCanvas" xmlns:cx="http://schemas.microsoft.com/office/drawing/2014/chartex" xmlns:cx1="http://schemas.microsoft.com/office/drawing/2015/9/8/chartex" xmlns:cx2="http://schemas.microsoft.com/office/drawing/2015/10/21/chartex" xmlns:cx3="http://schemas.microsoft.com/office/drawing/2016/5/9/chartex" xmlns:cx4="http://schemas.microsoft.com/office/drawing/2016/5/10/chartex" xmlns:cx5="http://schemas.microsoft.com/office/drawing/2016/5/11/chartex" xmlns:cx6="http://schemas.microsoft.com/office/drawing/2016/5/12/chartex" xmlns:cx7="http://schemas.microsoft.com/office/drawing/2016/5/13/chartex" xmlns:cx8="http://schemas.microsoft.com/office/drawing/2016/5/14/chartex" xmlns:mc="http://schemas.openxmlformats.org/markup-compatibility/2006" xmlns:aink="http://schemas.microsoft.com/office/drawing/2016/ink" xmlns:am3d="http://schemas.microsoft.com/office/drawing/2017/model3d" xmlns:o="urn:schemas-microsoft-com:office:office" xmlns:oel="http://schemas.microsoft.com/office/2019/extlst" xmlns:r="http://schemas.openxmlformats.org/officeDocument/2006/relationships" xmlns:m="http://schemas.openxmlformats.org/officeDocument/2006/math" xmlns:v="urn:schemas-microsoft-com:vml" xmlns:wp14="http://schemas.microsoft.com/office/word/2010/wordprocessingDrawing" xmlns:wp="http://schemas.openxmlformats.org/drawingml/2006/wordprocessingDrawing" xmlns:w10="urn:schemas-microsoft-com:office:word" xmlns:w="http://schemas.openxmlformats.org/wordprocessingml/2006/main" xmlns:w14="http://schemas.microsoft.com/office/word/2010/wordml" xmlns:w15="http://schemas.microsoft.com/office/word/2012/wordml" xmlns:w16cex="http://schemas.microsoft.com/office/word/2018/wordml/cex" xmlns:w16cid="http://schemas.microsoft.com/office/word/2016/wordml/cid" xmlns:w16="http://schemas.microsoft.com/office/word/2018/wordml" xmlns:w16du="http://schemas.microsoft.com/office/word/2023/wordml/word16du" xmlns:w16sdtdh="http://schemas.microsoft.com/office/word/2020/wordml/sdtdatahash" xmlns:w16sdtfl="http://schemas.microsoft.com/office/word/2024/wordml/sdtformatlock" xmlns:w16se="http://schemas.microsoft.com/office/word/2015/wordml/symex" xmlns:wpg="http://schemas.microsoft.com/office/word/2010/wordprocessingGroup" xmlns:wpi="http://schemas.microsoft.com/office/word/2010/wordprocessingInk" xmlns:wne="http://schemas.microsoft.com/office/word/2006/wordml" xmlns:wps="http://schemas.microsoft.com/office/word/2010/wordprocessingShape" mc:Ignorable="w14 w15 w16se w16cid w16 w16cex w16sdtdh w16sdtfl w16du wp14">
   <w:footnote w:type="separator" w:id="-1">
     <w:p>
       <w:r>
@@ -1457,7 +1566,7 @@
 </file>
 
 <file path=word/header1.xml><?xml version="1.0" encoding="utf-8"?>
-<w:hdr xmlns:wpc="http://schemas.microsoft.com/office/word/2010/wordprocessingCanvas" xmlns:cx="http://schemas.microsoft.com/office/drawing/2014/chartex" xmlns:cx1="http://schemas.microsoft.com/office/drawing/2015/9/8/chartex" xmlns:cx2="http://schemas.microsoft.com/office/drawing/2015/10/21/chartex" xmlns:cx3="http://schemas.microsoft.com/office/drawing/2016/5/9/chartex" xmlns:cx4="http://schemas.microsoft.com/office/drawing/2016/5/10/chartex" xmlns:cx5="http://schemas.microsoft.com/office/drawing/2016/5/11/chartex" xmlns:cx6="http://schemas.microsoft.com/office/drawing/2016/5/12/chartex" xmlns:cx7="http://schemas.microsoft.com/office/drawing/2016/5/13/chartex" xmlns:cx8="http://schemas.microsoft.com/office/drawing/2016/5/14/chartex" xmlns:mc="http://schemas.openxmlformats.org/markup-compatibility/2006" xmlns:aink="http://schemas.microsoft.com/office/drawing/2016/ink" xmlns:am3d="http://schemas.microsoft.com/office/drawing/2017/model3d" xmlns:o="urn:schemas-microsoft-com:office:office" xmlns:oel="http://schemas.microsoft.com/office/2019/extlst" xmlns:r="http://schemas.openxmlformats.org/officeDocument/2006/relationships" xmlns:m="http://schemas.openxmlformats.org/officeDocument/2006/math" xmlns:v="urn:schemas-microsoft-com:vml" xmlns:wp14="http://schemas.microsoft.com/office/word/2010/wordprocessingDrawing" xmlns:wp="http://schemas.openxmlformats.org/drawingml/2006/wordprocessingDrawing" xmlns:w10="urn:schemas-microsoft-com:office:word" xmlns:w="http://schemas.openxmlformats.org/wordprocessingml/2006/main" xmlns:w14="http://schemas.microsoft.com/office/word/2010/wordml" xmlns:w15="http://schemas.microsoft.com/office/word/2012/wordml" xmlns:w16cei="http://schemas.microsoft.com/office/word/2026/wordml/cei" xmlns:w16cex="http://schemas.microsoft.com/office/word/2018/wordml/cex" xmlns:w16cid="http://schemas.microsoft.com/office/word/2016/wordml/cid" xmlns:w16="http://schemas.microsoft.com/office/word/2018/wordml" xmlns:w16du="http://schemas.microsoft.com/office/word/2023/wordml/word16du" xmlns:w16sdtdh="http://schemas.microsoft.com/office/word/2020/wordml/sdtdatahash" xmlns:w16sdtfl="http://schemas.microsoft.com/office/word/2024/wordml/sdtformatlock" xmlns:w16se="http://schemas.microsoft.com/office/word/2015/wordml/symex" xmlns:wpg="http://schemas.microsoft.com/office/word/2010/wordprocessingGroup" xmlns:wpi="http://schemas.microsoft.com/office/word/2010/wordprocessingInk" xmlns:wne="http://schemas.microsoft.com/office/word/2006/wordml" xmlns:wps="http://schemas.microsoft.com/office/word/2010/wordprocessingShape" mc:Ignorable="w14 w15 w16se w16cid w16 w16cex w16sdtdh w16sdtfl w16du wp14">
+<w:hdr xmlns:wpc="http://schemas.microsoft.com/office/word/2010/wordprocessingCanvas" xmlns:cx="http://schemas.microsoft.com/office/drawing/2014/chartex" xmlns:cx1="http://schemas.microsoft.com/office/drawing/2015/9/8/chartex" xmlns:cx2="http://schemas.microsoft.com/office/drawing/2015/10/21/chartex" xmlns:cx3="http://schemas.microsoft.com/office/drawing/2016/5/9/chartex" xmlns:cx4="http://schemas.microsoft.com/office/drawing/2016/5/10/chartex" xmlns:cx5="http://schemas.microsoft.com/office/drawing/2016/5/11/chartex" xmlns:cx6="http://schemas.microsoft.com/office/drawing/2016/5/12/chartex" xmlns:cx7="http://schemas.microsoft.com/office/drawing/2016/5/13/chartex" xmlns:cx8="http://schemas.microsoft.com/office/drawing/2016/5/14/chartex" xmlns:mc="http://schemas.openxmlformats.org/markup-compatibility/2006" xmlns:aink="http://schemas.microsoft.com/office/drawing/2016/ink" xmlns:am3d="http://schemas.microsoft.com/office/drawing/2017/model3d" xmlns:o="urn:schemas-microsoft-com:office:office" xmlns:oel="http://schemas.microsoft.com/office/2019/extlst" xmlns:r="http://schemas.openxmlformats.org/officeDocument/2006/relationships" xmlns:m="http://schemas.openxmlformats.org/officeDocument/2006/math" xmlns:v="urn:schemas-microsoft-com:vml" xmlns:wp14="http://schemas.microsoft.com/office/word/2010/wordprocessingDrawing" xmlns:wp="http://schemas.openxmlformats.org/drawingml/2006/wordprocessingDrawing" xmlns:w10="urn:schemas-microsoft-com:office:word" xmlns:w="http://schemas.openxmlformats.org/wordprocessingml/2006/main" xmlns:w14="http://schemas.microsoft.com/office/word/2010/wordml" xmlns:w15="http://schemas.microsoft.com/office/word/2012/wordml" xmlns:w16cex="http://schemas.microsoft.com/office/word/2018/wordml/cex" xmlns:w16cid="http://schemas.microsoft.com/office/word/2016/wordml/cid" xmlns:w16="http://schemas.microsoft.com/office/word/2018/wordml" xmlns:w16du="http://schemas.microsoft.com/office/word/2023/wordml/word16du" xmlns:w16sdtdh="http://schemas.microsoft.com/office/word/2020/wordml/sdtdatahash" xmlns:w16sdtfl="http://schemas.microsoft.com/office/word/2024/wordml/sdtformatlock" xmlns:w16se="http://schemas.microsoft.com/office/word/2015/wordml/symex" xmlns:wpg="http://schemas.microsoft.com/office/word/2010/wordprocessingGroup" xmlns:wpi="http://schemas.microsoft.com/office/word/2010/wordprocessingInk" xmlns:wne="http://schemas.microsoft.com/office/word/2006/wordml" xmlns:wps="http://schemas.microsoft.com/office/word/2010/wordprocessingShape" mc:Ignorable="w14 w15 w16se w16cid w16 w16cex w16sdtdh w16sdtfl w16du wp14">
   <w:p>
     <w:pPr>
       <w:jc w:val="center"/>
@@ -1475,7 +1584,7 @@
 </file>
 
 <file path=word/numbering.xml><?xml version="1.0" encoding="utf-8"?>
-<w:numbering xmlns:wpc="http://schemas.microsoft.com/office/word/2010/wordprocessingCanvas" xmlns:cx="http://schemas.microsoft.com/office/drawing/2014/chartex" xmlns:cx1="http://schemas.microsoft.com/office/drawing/2015/9/8/chartex" xmlns:cx2="http://schemas.microsoft.com/office/drawing/2015/10/21/chartex" xmlns:cx3="http://schemas.microsoft.com/office/drawing/2016/5/9/chartex" xmlns:cx4="http://schemas.microsoft.com/office/drawing/2016/5/10/chartex" xmlns:cx5="http://schemas.microsoft.com/office/drawing/2016/5/11/chartex" xmlns:cx6="http://schemas.microsoft.com/office/drawing/2016/5/12/chartex" xmlns:cx7="http://schemas.microsoft.com/office/drawing/2016/5/13/chartex" xmlns:cx8="http://schemas.microsoft.com/office/drawing/2016/5/14/chartex" xmlns:mc="http://schemas.openxmlformats.org/markup-compatibility/2006" xmlns:aink="http://schemas.microsoft.com/office/drawing/2016/ink" xmlns:am3d="http://schemas.microsoft.com/office/drawing/2017/model3d" xmlns:o="urn:schemas-microsoft-com:office:office" xmlns:oel="http://schemas.microsoft.com/office/2019/extlst" xmlns:r="http://schemas.openxmlformats.org/officeDocument/2006/relationships" xmlns:m="http://schemas.openxmlformats.org/officeDocument/2006/math" xmlns:v="urn:schemas-microsoft-com:vml" xmlns:wp14="http://schemas.microsoft.com/office/word/2010/wordprocessingDrawing" xmlns:wp="http://schemas.openxmlformats.org/drawingml/2006/wordprocessingDrawing" xmlns:w10="urn:schemas-microsoft-com:office:word" xmlns:w="http://schemas.openxmlformats.org/wordprocessingml/2006/main" xmlns:w14="http://schemas.microsoft.com/office/word/2010/wordml" xmlns:w15="http://schemas.microsoft.com/office/word/2012/wordml" xmlns:w16cei="http://schemas.microsoft.com/office/word/2026/wordml/cei" xmlns:w16cex="http://schemas.microsoft.com/office/word/2018/wordml/cex" xmlns:w16cid="http://schemas.microsoft.com/office/word/2016/wordml/cid" xmlns:w16="http://schemas.microsoft.com/office/word/2018/wordml" xmlns:w16du="http://schemas.microsoft.com/office/word/2023/wordml/word16du" xmlns:w16sdtdh="http://schemas.microsoft.com/office/word/2020/wordml/sdtdatahash" xmlns:w16sdtfl="http://schemas.microsoft.com/office/word/2024/wordml/sdtformatlock" xmlns:w16se="http://schemas.microsoft.com/office/word/2015/wordml/symex" xmlns:wpg="http://schemas.microsoft.com/office/word/2010/wordprocessingGroup" xmlns:wpi="http://schemas.microsoft.com/office/word/2010/wordprocessingInk" xmlns:wne="http://schemas.microsoft.com/office/word/2006/wordml" xmlns:wps="http://schemas.microsoft.com/office/word/2010/wordprocessingShape" mc:Ignorable="w14 w15 w16se w16cid w16 w16cex w16sdtdh w16sdtfl w16du wp14">
+<w:numbering xmlns:wpc="http://schemas.microsoft.com/office/word/2010/wordprocessingCanvas" xmlns:cx="http://schemas.microsoft.com/office/drawing/2014/chartex" xmlns:cx1="http://schemas.microsoft.com/office/drawing/2015/9/8/chartex" xmlns:cx2="http://schemas.microsoft.com/office/drawing/2015/10/21/chartex" xmlns:cx3="http://schemas.microsoft.com/office/drawing/2016/5/9/chartex" xmlns:cx4="http://schemas.microsoft.com/office/drawing/2016/5/10/chartex" xmlns:cx5="http://schemas.microsoft.com/office/drawing/2016/5/11/chartex" xmlns:cx6="http://schemas.microsoft.com/office/drawing/2016/5/12/chartex" xmlns:cx7="http://schemas.microsoft.com/office/drawing/2016/5/13/chartex" xmlns:cx8="http://schemas.microsoft.com/office/drawing/2016/5/14/chartex" xmlns:mc="http://schemas.openxmlformats.org/markup-compatibility/2006" xmlns:aink="http://schemas.microsoft.com/office/drawing/2016/ink" xmlns:am3d="http://schemas.microsoft.com/office/drawing/2017/model3d" xmlns:o="urn:schemas-microsoft-com:office:office" xmlns:oel="http://schemas.microsoft.com/office/2019/extlst" xmlns:r="http://schemas.openxmlformats.org/officeDocument/2006/relationships" xmlns:m="http://schemas.openxmlformats.org/officeDocument/2006/math" xmlns:v="urn:schemas-microsoft-com:vml" xmlns:wp14="http://schemas.microsoft.com/office/word/2010/wordprocessingDrawing" xmlns:wp="http://schemas.openxmlformats.org/drawingml/2006/wordprocessingDrawing" xmlns:w10="urn:schemas-microsoft-com:office:word" xmlns:w="http://schemas.openxmlformats.org/wordprocessingml/2006/main" xmlns:w14="http://schemas.microsoft.com/office/word/2010/wordml" xmlns:w15="http://schemas.microsoft.com/office/word/2012/wordml" xmlns:w16cex="http://schemas.microsoft.com/office/word/2018/wordml/cex" xmlns:w16cid="http://schemas.microsoft.com/office/word/2016/wordml/cid" xmlns:w16="http://schemas.microsoft.com/office/word/2018/wordml" xmlns:w16du="http://schemas.microsoft.com/office/word/2023/wordml/word16du" xmlns:w16sdtdh="http://schemas.microsoft.com/office/word/2020/wordml/sdtdatahash" xmlns:w16sdtfl="http://schemas.microsoft.com/office/word/2024/wordml/sdtformatlock" xmlns:w16se="http://schemas.microsoft.com/office/word/2015/wordml/symex" xmlns:wpg="http://schemas.microsoft.com/office/word/2010/wordprocessingGroup" xmlns:wpi="http://schemas.microsoft.com/office/word/2010/wordprocessingInk" xmlns:wne="http://schemas.microsoft.com/office/word/2006/wordml" xmlns:wps="http://schemas.microsoft.com/office/word/2010/wordprocessingShape" mc:Ignorable="w14 w15 w16se w16cid w16 w16cex w16sdtdh w16sdtfl w16du wp14">
   <w:abstractNum w:abstractNumId="0" w15:restartNumberingAfterBreak="0">
     <w:nsid w:val="11CD0DCE"/>
     <w:multiLevelType w:val="hybridMultilevel"/>

</xml_diff>